<commit_message>
Redesign application form with clean, spacious Word layout
- Full-width dark navy title banner with subtitle
- Section headers as solid color bars (01 / 02 / 03)
- Fields use underline-only style with label+hint, no cramped table borders
- Two-column field pairs for compact info, textarea for description
- Checkbox groups in clean 2-column grid
- Shaded acknowledgement rows and signature line at bottom

Co-Authored-By: Claude Sonnet 4.6 <noreply@anthropic.com>
</commit_message>
<xml_diff>
--- a/VRUD_Access_Application_Form.docx
+++ b/VRUD_Access_Application_Form.docx
@@ -2,33 +2,6 @@
 <file path=word/document.xml><?xml version="1.0" encoding="utf-8"?>
 <w:document xmlns:wpc="http://schemas.microsoft.com/office/word/2010/wordprocessingCanvas" xmlns:mo="http://schemas.microsoft.com/office/mac/office/2008/main" xmlns:mc="http://schemas.openxmlformats.org/markup-compatibility/2006" xmlns:mv="urn:schemas-microsoft-com:mac:vml" xmlns:o="urn:schemas-microsoft-com:office:office" xmlns:r="http://schemas.openxmlformats.org/officeDocument/2006/relationships" xmlns:m="http://schemas.openxmlformats.org/officeDocument/2006/math" xmlns:v="urn:schemas-microsoft-com:vml" xmlns:wp14="http://schemas.microsoft.com/office/word/2010/wordprocessingDrawing" xmlns:wp="http://schemas.openxmlformats.org/drawingml/2006/wordprocessingDrawing" xmlns:w10="urn:schemas-microsoft-com:office:word" xmlns:w="http://schemas.openxmlformats.org/wordprocessingml/2006/main" xmlns:w14="http://schemas.microsoft.com/office/word/2010/wordml" xmlns:wpg="http://schemas.microsoft.com/office/word/2010/wordprocessingGroup" xmlns:wpi="http://schemas.microsoft.com/office/word/2010/wordprocessingInk" xmlns:wne="http://schemas.microsoft.com/office/word/2006/wordml" xmlns:wps="http://schemas.microsoft.com/office/word/2010/wordprocessingShape" mc:Ignorable="w14 wp14">
   <w:body>
-    <w:p>
-      <w:pPr>
-        <w:jc w:val="center"/>
-      </w:pPr>
-      <w:r>
-        <w:rPr>
-          <w:b/>
-          <w:color w:val="1A56A0"/>
-          <w:sz w:val="32"/>
-        </w:rPr>
-        <w:t>VRUD Dataset Access Application Form</w:t>
-      </w:r>
-    </w:p>
-    <w:p>
-      <w:pPr>
-        <w:jc w:val="center"/>
-      </w:pPr>
-      <w:r>
-        <w:rPr>
-          <w:i/>
-          <w:color w:val="555555"/>
-          <w:sz w:val="22"/>
-        </w:rPr>
-        <w:t>Vehicle-Vulnerable Road User Interaction Dataset</w:t>
-      </w:r>
-    </w:p>
-    <w:p/>
     <w:tbl>
       <w:tblPr>
         <w:tblStyle w:val="TableGrid"/>
@@ -36,71 +9,583 @@
         <w:tblLook w:firstColumn="1" w:firstRow="1" w:lastColumn="0" w:lastRow="0" w:noHBand="0" w:noVBand="1" w:val="04A0"/>
       </w:tblPr>
       <w:tblGrid>
-        <w:gridCol w:w="8838"/>
+        <w:gridCol w:w="9066"/>
       </w:tblGrid>
       <w:tr>
+        <w:trPr>
+          <w:trHeight w:val="900"/>
+        </w:trPr>
         <w:tc>
           <w:tcPr>
-            <w:tcW w:type="dxa" w:w="8838"/>
-            <w:shd w:val="clear" w:color="auto" w:fill="EBF3FB"/>
+            <w:tcW w:type="dxa" w:w="9066"/>
+            <w:shd w:val="clear" w:color="auto" w:fill="1A3A5C"/>
+            <w:tcBorders>
+              <w:top w:val="nil"/>
+              <w:left w:val="nil"/>
+              <w:bottom w:val="nil"/>
+              <w:right w:val="nil"/>
+              <w:insideH w:val="nil"/>
+              <w:insideV w:val="nil"/>
+            </w:tcBorders>
           </w:tcPr>
           <w:p>
             <w:pPr>
-              <w:jc w:val="left"/>
+              <w:jc w:val="center"/>
+              <w:spacing w:before="140" w:after="40"/>
             </w:pPr>
             <w:r>
               <w:rPr>
+                <w:rFonts w:ascii="Calibri" w:hAnsi="Calibri"/>
                 <w:b/>
-                <w:color w:val="1A56A0"/>
-                <w:sz w:val="20"/>
+                <w:color w:val="FFFFFF"/>
+                <w:sz w:val="30"/>
               </w:rPr>
-              <w:t xml:space="preserve">How to apply:  </w:t>
-            </w:r>
-            <w:r>
-              <w:rPr>
-                <w:sz w:val="20"/>
-              </w:rPr>
-              <w:t>Fill in all fields below and send this document to:</w:t>
+              <w:t>VRUD Dataset  ·  Data Access Application Form</w:t>
             </w:r>
           </w:p>
           <w:p>
+            <w:pPr>
+              <w:jc w:val="center"/>
+              <w:spacing w:before="0" w:after="120"/>
+            </w:pPr>
             <w:r>
               <w:rPr>
-                <w:b/>
-                <w:color w:val="1A56A0"/>
+                <w:rFonts w:ascii="Calibri" w:hAnsi="Calibri"/>
+                <w:i/>
+                <w:color w:val="B0C8E8"/>
                 <w:sz w:val="20"/>
               </w:rPr>
-              <w:t xml:space="preserve">    yuxinzhang@jlu.edu.cn   |   ziyu25@mails.jlu.edu.cn</w:t>
-            </w:r>
-          </w:p>
-          <w:p>
-            <w:r>
-              <w:rPr>
-                <w:i/>
-                <w:color w:val="444444"/>
-                <w:sz w:val="19"/>
-              </w:rPr>
-              <w:t>Subject line: [VRUD Access Request] &lt;Your Name&gt;</w:t>
+              <w:t>Vehicle-Vulnerable Road User Interaction Dataset  ·  Jilin University</w:t>
             </w:r>
           </w:p>
         </w:tc>
       </w:tr>
     </w:tbl>
-    <w:p/>
+    <w:tbl>
+      <w:tblPr>
+        <w:tblStyle w:val="TableGrid"/>
+        <w:tblW w:type="auto" w:w="0"/>
+        <w:tblLook w:firstColumn="1" w:firstRow="1" w:lastColumn="0" w:lastRow="0" w:noHBand="0" w:noVBand="1" w:val="04A0"/>
+      </w:tblPr>
+      <w:tblGrid>
+        <w:gridCol w:w="9066"/>
+      </w:tblGrid>
+      <w:tr>
+        <w:tc>
+          <w:tcPr>
+            <w:tcW w:type="dxa" w:w="9066"/>
+            <w:shd w:val="clear" w:color="auto" w:fill="EBF3FB"/>
+            <w:tcBorders>
+              <w:top w:val="nil"/>
+              <w:left w:val="nil"/>
+              <w:bottom w:val="nil"/>
+              <w:right w:val="nil"/>
+              <w:insideH w:val="nil"/>
+              <w:insideV w:val="nil"/>
+            </w:tcBorders>
+          </w:tcPr>
+          <w:p>
+            <w:pPr>
+              <w:jc w:val="center"/>
+              <w:spacing w:before="100" w:after="100"/>
+            </w:pPr>
+            <w:r>
+              <w:rPr>
+                <w:rFonts w:ascii="Calibri" w:hAnsi="Calibri"/>
+                <w:color w:val="444444"/>
+                <w:sz w:val="20"/>
+              </w:rPr>
+              <w:t xml:space="preserve">Please complete all fields and email this document to:   </w:t>
+            </w:r>
+            <w:r>
+              <w:rPr>
+                <w:rFonts w:ascii="Calibri" w:hAnsi="Calibri"/>
+                <w:b/>
+                <w:color w:val="1A56A0"/>
+                <w:sz w:val="20"/>
+              </w:rPr>
+              <w:t>yuxinzhang@jlu.edu.cn   |   ziyu25@mails.jlu.edu.cn</w:t>
+            </w:r>
+          </w:p>
+          <w:p>
+            <w:pPr>
+              <w:jc w:val="center"/>
+              <w:spacing w:before="0" w:after="100"/>
+            </w:pPr>
+            <w:r>
+              <w:rPr>
+                <w:rFonts w:ascii="Calibri" w:hAnsi="Calibri"/>
+                <w:i/>
+                <w:color w:val="666666"/>
+                <w:sz w:val="19"/>
+              </w:rPr>
+              <w:t>Subject line:  [VRUD Access Request]  &lt;Your Name&gt;</w:t>
+            </w:r>
+          </w:p>
+        </w:tc>
+      </w:tr>
+    </w:tbl>
     <w:p>
       <w:pPr>
-        <w:spacing w:before="120" w:after="40"/>
-        <w:pBdr>
-          <w:bottom w:val="single" w:sz="4" w:space="1" w:color="1A56A0"/>
-        </w:pBdr>
+        <w:spacing w:before="0" w:after="0"/>
+        <w:spacing w:before="260" w:after="0"/>
+      </w:pPr>
+    </w:p>
+    <w:tbl>
+      <w:tblPr>
+        <w:tblStyle w:val="TableGrid"/>
+        <w:tblW w:type="auto" w:w="0"/>
+        <w:tblLook w:firstColumn="1" w:firstRow="1" w:lastColumn="0" w:lastRow="0" w:noHBand="0" w:noVBand="1" w:val="04A0"/>
+      </w:tblPr>
+      <w:tblGrid>
+        <w:gridCol w:w="9066"/>
+      </w:tblGrid>
+      <w:tr>
+        <w:trPr>
+          <w:trHeight w:val="420"/>
+        </w:trPr>
+        <w:tc>
+          <w:tcPr>
+            <w:tcW w:type="dxa" w:w="9066"/>
+            <w:shd w:val="clear" w:color="auto" w:fill="2C5282"/>
+            <w:tcBorders>
+              <w:top w:val="nil"/>
+              <w:left w:val="nil"/>
+              <w:bottom w:val="nil"/>
+              <w:right w:val="nil"/>
+              <w:insideH w:val="nil"/>
+              <w:insideV w:val="nil"/>
+            </w:tcBorders>
+          </w:tcPr>
+          <w:p>
+            <w:pPr>
+              <w:jc w:val="left"/>
+              <w:spacing w:before="60" w:after="60"/>
+            </w:pPr>
+            <w:r>
+              <w:rPr>
+                <w:rFonts w:ascii="Calibri" w:hAnsi="Calibri"/>
+                <w:b/>
+                <w:color w:val="B0C8E8"/>
+                <w:sz w:val="20"/>
+              </w:rPr>
+              <w:t xml:space="preserve">  01  </w:t>
+            </w:r>
+            <w:r>
+              <w:rPr>
+                <w:rFonts w:ascii="Calibri" w:hAnsi="Calibri"/>
+                <w:b/>
+                <w:color w:val="FFFFFF"/>
+                <w:sz w:val="22"/>
+              </w:rPr>
+              <w:t>Applicant Information</w:t>
+            </w:r>
+          </w:p>
+        </w:tc>
+      </w:tr>
+    </w:tbl>
+    <w:p>
+      <w:pPr>
+        <w:spacing w:before="0" w:after="0"/>
+      </w:pPr>
+    </w:p>
+    <w:tbl>
+      <w:tblPr>
+        <w:tblStyle w:val="TableGrid"/>
+        <w:tblW w:type="auto" w:w="0"/>
+        <w:tblLook w:firstColumn="1" w:firstRow="1" w:lastColumn="0" w:lastRow="0" w:noHBand="0" w:noVBand="1" w:val="04A0"/>
+      </w:tblPr>
+      <w:tblGrid>
+        <w:gridCol w:w="2154"/>
+        <w:gridCol w:w="3288"/>
+        <w:gridCol w:w="2154"/>
+        <w:gridCol w:w="3288"/>
+      </w:tblGrid>
+      <w:tr>
+        <w:tc>
+          <w:tcPr>
+            <w:tcW w:type="dxa" w:w="2266"/>
+            <w:tcBorders>
+              <w:top w:val="nil"/>
+              <w:left w:val="nil"/>
+              <w:bottom w:val="nil"/>
+              <w:right w:val="nil"/>
+              <w:insideH w:val="nil"/>
+              <w:insideV w:val="nil"/>
+            </w:tcBorders>
+          </w:tcPr>
+          <w:p>
+            <w:pPr>
+              <w:spacing w:before="60" w:after="60"/>
+            </w:pPr>
+            <w:r>
+              <w:rPr>
+                <w:rFonts w:ascii="Calibri" w:hAnsi="Calibri"/>
+                <w:b/>
+                <w:color w:val="2C5282"/>
+                <w:sz w:val="20"/>
+              </w:rPr>
+              <w:t>Full Name</w:t>
+            </w:r>
+          </w:p>
+        </w:tc>
+        <w:tc>
+          <w:tcPr>
+            <w:tcW w:type="dxa" w:w="2266"/>
+            <w:tcBorders>
+              <w:top w:val="nil"/>
+              <w:left w:val="nil"/>
+              <w:right w:val="nil"/>
+              <w:bottom w:val="single" w:sz="6" w:space="0" w:color="2C5282"/>
+            </w:tcBorders>
+          </w:tcPr>
+          <w:p>
+            <w:pPr>
+              <w:spacing w:before="60" w:after="60"/>
+            </w:pPr>
+            <w:r>
+              <w:rPr>
+                <w:rFonts w:ascii="Calibri" w:hAnsi="Calibri"/>
+                <w:i/>
+                <w:color w:val="BBBBBB"/>
+                <w:sz w:val="19"/>
+              </w:rPr>
+              <w:t>e.g., Zhang San</w:t>
+            </w:r>
+          </w:p>
+        </w:tc>
+        <w:tc>
+          <w:tcPr>
+            <w:tcW w:type="dxa" w:w="2266"/>
+            <w:tcBorders>
+              <w:top w:val="nil"/>
+              <w:left w:val="nil"/>
+              <w:bottom w:val="nil"/>
+              <w:right w:val="nil"/>
+              <w:insideH w:val="nil"/>
+              <w:insideV w:val="nil"/>
+            </w:tcBorders>
+          </w:tcPr>
+          <w:p>
+            <w:pPr>
+              <w:spacing w:before="60" w:after="60"/>
+            </w:pPr>
+            <w:r>
+              <w:rPr>
+                <w:rFonts w:ascii="Calibri" w:hAnsi="Calibri"/>
+                <w:b/>
+                <w:color w:val="2C5282"/>
+                <w:sz w:val="20"/>
+              </w:rPr>
+              <w:t>Email Address</w:t>
+            </w:r>
+          </w:p>
+        </w:tc>
+        <w:tc>
+          <w:tcPr>
+            <w:tcW w:type="dxa" w:w="2266"/>
+            <w:tcBorders>
+              <w:top w:val="nil"/>
+              <w:left w:val="nil"/>
+              <w:right w:val="nil"/>
+              <w:bottom w:val="single" w:sz="6" w:space="0" w:color="2C5282"/>
+            </w:tcBorders>
+          </w:tcPr>
+          <w:p>
+            <w:pPr>
+              <w:spacing w:before="60" w:after="60"/>
+            </w:pPr>
+            <w:r>
+              <w:rPr>
+                <w:rFonts w:ascii="Calibri" w:hAnsi="Calibri"/>
+                <w:i/>
+                <w:color w:val="BBBBBB"/>
+                <w:sz w:val="19"/>
+              </w:rPr>
+              <w:t>e.g., zhangsan@university.edu.cn</w:t>
+            </w:r>
+          </w:p>
+        </w:tc>
+      </w:tr>
+    </w:tbl>
+    <w:p>
+      <w:pPr>
+        <w:spacing w:before="0" w:after="0"/>
+        <w:spacing w:before="60" w:after="0"/>
+      </w:pPr>
+    </w:p>
+    <w:tbl>
+      <w:tblPr>
+        <w:tblStyle w:val="TableGrid"/>
+        <w:tblW w:type="auto" w:w="0"/>
+        <w:tblLook w:firstColumn="1" w:firstRow="1" w:lastColumn="0" w:lastRow="0" w:noHBand="0" w:noVBand="1" w:val="04A0"/>
+      </w:tblPr>
+      <w:tblGrid>
+        <w:gridCol w:w="2154"/>
+        <w:gridCol w:w="3288"/>
+        <w:gridCol w:w="2154"/>
+        <w:gridCol w:w="3288"/>
+      </w:tblGrid>
+      <w:tr>
+        <w:tc>
+          <w:tcPr>
+            <w:tcW w:type="dxa" w:w="2266"/>
+            <w:tcBorders>
+              <w:top w:val="nil"/>
+              <w:left w:val="nil"/>
+              <w:bottom w:val="nil"/>
+              <w:right w:val="nil"/>
+              <w:insideH w:val="nil"/>
+              <w:insideV w:val="nil"/>
+            </w:tcBorders>
+          </w:tcPr>
+          <w:p>
+            <w:pPr>
+              <w:spacing w:before="60" w:after="60"/>
+            </w:pPr>
+            <w:r>
+              <w:rPr>
+                <w:rFonts w:ascii="Calibri" w:hAnsi="Calibri"/>
+                <w:b/>
+                <w:color w:val="2C5282"/>
+                <w:sz w:val="20"/>
+              </w:rPr>
+              <w:t>Institution / Company</w:t>
+            </w:r>
+          </w:p>
+        </w:tc>
+        <w:tc>
+          <w:tcPr>
+            <w:tcW w:type="dxa" w:w="2266"/>
+            <w:tcBorders>
+              <w:top w:val="nil"/>
+              <w:left w:val="nil"/>
+              <w:right w:val="nil"/>
+              <w:bottom w:val="single" w:sz="6" w:space="0" w:color="2C5282"/>
+            </w:tcBorders>
+          </w:tcPr>
+          <w:p>
+            <w:pPr>
+              <w:spacing w:before="60" w:after="60"/>
+            </w:pPr>
+            <w:r>
+              <w:rPr>
+                <w:rFonts w:ascii="Calibri" w:hAnsi="Calibri"/>
+                <w:i/>
+                <w:color w:val="BBBBBB"/>
+                <w:sz w:val="19"/>
+              </w:rPr>
+              <w:t>e.g., Jilin University</w:t>
+            </w:r>
+          </w:p>
+        </w:tc>
+        <w:tc>
+          <w:tcPr>
+            <w:tcW w:type="dxa" w:w="2266"/>
+            <w:tcBorders>
+              <w:top w:val="nil"/>
+              <w:left w:val="nil"/>
+              <w:bottom w:val="nil"/>
+              <w:right w:val="nil"/>
+              <w:insideH w:val="nil"/>
+              <w:insideV w:val="nil"/>
+            </w:tcBorders>
+          </w:tcPr>
+          <w:p>
+            <w:pPr>
+              <w:spacing w:before="60" w:after="60"/>
+            </w:pPr>
+            <w:r>
+              <w:rPr>
+                <w:rFonts w:ascii="Calibri" w:hAnsi="Calibri"/>
+                <w:b/>
+                <w:color w:val="2C5282"/>
+                <w:sz w:val="20"/>
+              </w:rPr>
+              <w:t>Department / Team</w:t>
+            </w:r>
+          </w:p>
+        </w:tc>
+        <w:tc>
+          <w:tcPr>
+            <w:tcW w:type="dxa" w:w="2266"/>
+            <w:tcBorders>
+              <w:top w:val="nil"/>
+              <w:left w:val="nil"/>
+              <w:right w:val="nil"/>
+              <w:bottom w:val="single" w:sz="6" w:space="0" w:color="2C5282"/>
+            </w:tcBorders>
+          </w:tcPr>
+          <w:p>
+            <w:pPr>
+              <w:spacing w:before="60" w:after="60"/>
+            </w:pPr>
+            <w:r>
+              <w:rPr>
+                <w:rFonts w:ascii="Calibri" w:hAnsi="Calibri"/>
+                <w:i/>
+                <w:color w:val="BBBBBB"/>
+                <w:sz w:val="19"/>
+              </w:rPr>
+              <w:t>(optional)</w:t>
+            </w:r>
+          </w:p>
+        </w:tc>
+      </w:tr>
+    </w:tbl>
+    <w:p>
+      <w:pPr>
+        <w:spacing w:before="0" w:after="0"/>
+        <w:spacing w:before="60" w:after="0"/>
+      </w:pPr>
+    </w:p>
+    <w:tbl>
+      <w:tblPr>
+        <w:tblStyle w:val="TableGrid"/>
+        <w:tblW w:type="auto" w:w="0"/>
+        <w:tblLook w:firstColumn="1" w:firstRow="1" w:lastColumn="0" w:lastRow="0" w:noHBand="0" w:noVBand="1" w:val="04A0"/>
+      </w:tblPr>
+      <w:tblGrid>
+        <w:gridCol w:w="2268"/>
+        <w:gridCol w:w="8617"/>
+      </w:tblGrid>
+      <w:tr>
+        <w:tc>
+          <w:tcPr>
+            <w:tcW w:type="dxa" w:w="4533"/>
+            <w:tcBorders>
+              <w:top w:val="nil"/>
+              <w:left w:val="nil"/>
+              <w:bottom w:val="nil"/>
+              <w:right w:val="nil"/>
+              <w:insideH w:val="nil"/>
+              <w:insideV w:val="nil"/>
+            </w:tcBorders>
+          </w:tcPr>
+          <w:p>
+            <w:pPr>
+              <w:spacing w:before="60" w:after="60"/>
+            </w:pPr>
+            <w:r>
+              <w:rPr>
+                <w:rFonts w:ascii="Calibri" w:hAnsi="Calibri"/>
+                <w:b/>
+                <w:color w:val="2C5282"/>
+                <w:sz w:val="20"/>
+              </w:rPr>
+              <w:t>Country / Region</w:t>
+            </w:r>
+          </w:p>
+        </w:tc>
+        <w:tc>
+          <w:tcPr>
+            <w:tcW w:type="dxa" w:w="4533"/>
+            <w:tcBorders>
+              <w:top w:val="nil"/>
+              <w:left w:val="nil"/>
+              <w:right w:val="nil"/>
+              <w:bottom w:val="single" w:sz="6" w:space="0" w:color="2C5282"/>
+            </w:tcBorders>
+          </w:tcPr>
+          <w:p>
+            <w:pPr>
+              <w:spacing w:before="60" w:after="60"/>
+            </w:pPr>
+            <w:r>
+              <w:rPr>
+                <w:rFonts w:ascii="Calibri" w:hAnsi="Calibri"/>
+                <w:i/>
+                <w:color w:val="BBBBBB"/>
+                <w:sz w:val="19"/>
+              </w:rPr>
+              <w:t>e.g., China</w:t>
+            </w:r>
+          </w:p>
+        </w:tc>
+      </w:tr>
+    </w:tbl>
+    <w:p>
+      <w:pPr>
+        <w:spacing w:before="0" w:after="0"/>
+        <w:spacing w:before="60" w:after="0"/>
+      </w:pPr>
+    </w:p>
+    <w:p>
+      <w:pPr>
+        <w:spacing w:before="0" w:after="0"/>
+        <w:spacing w:before="260" w:after="0"/>
+      </w:pPr>
+    </w:p>
+    <w:tbl>
+      <w:tblPr>
+        <w:tblStyle w:val="TableGrid"/>
+        <w:tblW w:type="auto" w:w="0"/>
+        <w:tblLook w:firstColumn="1" w:firstRow="1" w:lastColumn="0" w:lastRow="0" w:noHBand="0" w:noVBand="1" w:val="04A0"/>
+      </w:tblPr>
+      <w:tblGrid>
+        <w:gridCol w:w="9066"/>
+      </w:tblGrid>
+      <w:tr>
+        <w:trPr>
+          <w:trHeight w:val="420"/>
+        </w:trPr>
+        <w:tc>
+          <w:tcPr>
+            <w:tcW w:type="dxa" w:w="9066"/>
+            <w:shd w:val="clear" w:color="auto" w:fill="2C5282"/>
+            <w:tcBorders>
+              <w:top w:val="nil"/>
+              <w:left w:val="nil"/>
+              <w:bottom w:val="nil"/>
+              <w:right w:val="nil"/>
+              <w:insideH w:val="nil"/>
+              <w:insideV w:val="nil"/>
+            </w:tcBorders>
+          </w:tcPr>
+          <w:p>
+            <w:pPr>
+              <w:jc w:val="left"/>
+              <w:spacing w:before="60" w:after="60"/>
+            </w:pPr>
+            <w:r>
+              <w:rPr>
+                <w:rFonts w:ascii="Calibri" w:hAnsi="Calibri"/>
+                <w:b/>
+                <w:color w:val="B0C8E8"/>
+                <w:sz w:val="20"/>
+              </w:rPr>
+              <w:t xml:space="preserve">  02  </w:t>
+            </w:r>
+            <w:r>
+              <w:rPr>
+                <w:rFonts w:ascii="Calibri" w:hAnsi="Calibri"/>
+                <w:b/>
+                <w:color w:val="FFFFFF"/>
+                <w:sz w:val="22"/>
+              </w:rPr>
+              <w:t>Intended Use</w:t>
+            </w:r>
+          </w:p>
+        </w:tc>
+      </w:tr>
+    </w:tbl>
+    <w:p>
+      <w:pPr>
+        <w:spacing w:before="0" w:after="0"/>
+      </w:pPr>
+    </w:p>
+    <w:p>
+      <w:pPr>
+        <w:spacing w:before="80" w:after="30"/>
       </w:pPr>
       <w:r>
         <w:rPr>
+          <w:rFonts w:ascii="Calibri" w:hAnsi="Calibri"/>
           <w:b/>
-          <w:color w:val="1A56A0"/>
-          <w:sz w:val="22"/>
+          <w:color w:val="2C5282"/>
+          <w:sz w:val="20"/>
         </w:rPr>
-        <w:t>1.  Applicant Information</w:t>
+        <w:t>Primary Purpose</w:t>
       </w:r>
     </w:p>
     <w:tbl>
@@ -110,41 +595,59 @@
         <w:tblLook w:firstColumn="1" w:firstRow="1" w:lastColumn="0" w:lastRow="0" w:noHBand="0" w:noVBand="1" w:val="04A0"/>
       </w:tblPr>
       <w:tblGrid>
-        <w:gridCol w:w="2835"/>
-        <w:gridCol w:w="6520"/>
+        <w:gridCol w:w="4533"/>
+        <w:gridCol w:w="4533"/>
       </w:tblGrid>
       <w:tr>
         <w:tc>
           <w:tcPr>
-            <w:tcW w:type="dxa" w:w="4419"/>
-            <w:shd w:val="clear" w:color="auto" w:fill="F0F4F9"/>
-            <w:vAlign w:val="center"/>
+            <w:tcW w:type="dxa" w:w="4533"/>
+            <w:tcBorders>
+              <w:top w:val="nil"/>
+              <w:left w:val="nil"/>
+              <w:bottom w:val="nil"/>
+              <w:right w:val="nil"/>
+              <w:insideH w:val="nil"/>
+              <w:insideV w:val="nil"/>
+            </w:tcBorders>
           </w:tcPr>
           <w:p>
             <w:pPr>
-              <w:jc w:val="left"/>
+              <w:spacing w:before="50" w:after="50"/>
             </w:pPr>
             <w:r>
               <w:rPr>
-                <w:b/>
+                <w:rFonts w:ascii="Calibri" w:hAnsi="Calibri"/>
+                <w:color w:val="222222"/>
                 <w:sz w:val="20"/>
               </w:rPr>
-              <w:t>Full Name</w:t>
+              <w:t>☐   Academic Research</w:t>
             </w:r>
           </w:p>
         </w:tc>
         <w:tc>
           <w:tcPr>
-            <w:tcW w:type="dxa" w:w="4419"/>
+            <w:tcW w:type="dxa" w:w="4533"/>
+            <w:tcBorders>
+              <w:top w:val="nil"/>
+              <w:left w:val="nil"/>
+              <w:bottom w:val="nil"/>
+              <w:right w:val="nil"/>
+              <w:insideH w:val="nil"/>
+              <w:insideV w:val="nil"/>
+            </w:tcBorders>
           </w:tcPr>
           <w:p>
+            <w:pPr>
+              <w:spacing w:before="50" w:after="50"/>
+            </w:pPr>
             <w:r>
               <w:rPr>
-                <w:i/>
-                <w:color w:val="AAAAAA"/>
-                <w:sz w:val="18"/>
+                <w:rFonts w:ascii="Calibri" w:hAnsi="Calibri"/>
+                <w:color w:val="222222"/>
+                <w:sz w:val="20"/>
               </w:rPr>
-              <w:t>e.g., Zhang San</w:t>
+              <w:t>☐   Industrial / Commercial Application</w:t>
             </w:r>
           </w:p>
         </w:tc>
@@ -152,21 +655,62 @@
       <w:tr>
         <w:tc>
           <w:tcPr>
-            <w:tcW w:type="dxa" w:w="4419"/>
+            <w:tcW w:type="dxa" w:w="4533"/>
+            <w:tcBorders>
+              <w:top w:val="nil"/>
+              <w:left w:val="nil"/>
+              <w:bottom w:val="nil"/>
+              <w:right w:val="nil"/>
+              <w:insideH w:val="nil"/>
+              <w:insideV w:val="nil"/>
+            </w:tcBorders>
           </w:tcPr>
-          <w:p/>
+          <w:p>
+            <w:pPr>
+              <w:spacing w:before="50" w:after="50"/>
+            </w:pPr>
+            <w:r>
+              <w:rPr>
+                <w:rFonts w:ascii="Calibri" w:hAnsi="Calibri"/>
+                <w:color w:val="222222"/>
+                <w:sz w:val="20"/>
+              </w:rPr>
+              <w:t>☐   Teaching / Course Material</w:t>
+            </w:r>
+          </w:p>
         </w:tc>
         <w:tc>
           <w:tcPr>
-            <w:tcW w:type="dxa" w:w="4419"/>
+            <w:tcW w:type="dxa" w:w="4533"/>
+            <w:tcBorders>
+              <w:top w:val="nil"/>
+              <w:left w:val="nil"/>
+              <w:bottom w:val="nil"/>
+              <w:right w:val="nil"/>
+              <w:insideH w:val="nil"/>
+              <w:insideV w:val="nil"/>
+            </w:tcBorders>
           </w:tcPr>
-          <w:p/>
+          <w:p>
+            <w:pPr>
+              <w:spacing w:before="50" w:after="50"/>
+            </w:pPr>
+            <w:r>
+              <w:rPr>
+                <w:rFonts w:ascii="Calibri" w:hAnsi="Calibri"/>
+                <w:color w:val="222222"/>
+                <w:sz w:val="20"/>
+              </w:rPr>
+              <w:t>☐   Other: ________________________________</w:t>
+            </w:r>
+          </w:p>
         </w:tc>
       </w:tr>
     </w:tbl>
     <w:p>
       <w:pPr>
-        <w:spacing w:after="80"/>
+        <w:spacing w:before="0" w:after="0"/>
+        <w:spacing w:before="60" w:after="0"/>
       </w:pPr>
     </w:p>
     <w:tbl>
@@ -176,41 +720,119 @@
         <w:tblLook w:firstColumn="1" w:firstRow="1" w:lastColumn="0" w:lastRow="0" w:noHBand="0" w:noVBand="1" w:val="04A0"/>
       </w:tblPr>
       <w:tblGrid>
-        <w:gridCol w:w="2835"/>
-        <w:gridCol w:w="6520"/>
+        <w:gridCol w:w="2721"/>
+        <w:gridCol w:w="8164"/>
       </w:tblGrid>
       <w:tr>
         <w:tc>
           <w:tcPr>
-            <w:tcW w:type="dxa" w:w="4419"/>
-            <w:shd w:val="clear" w:color="auto" w:fill="F0F4F9"/>
-            <w:vAlign w:val="center"/>
+            <w:tcW w:type="dxa" w:w="4533"/>
+            <w:tcBorders>
+              <w:top w:val="nil"/>
+              <w:left w:val="nil"/>
+              <w:bottom w:val="nil"/>
+              <w:right w:val="nil"/>
+              <w:insideH w:val="nil"/>
+              <w:insideV w:val="nil"/>
+            </w:tcBorders>
           </w:tcPr>
           <w:p>
             <w:pPr>
-              <w:jc w:val="left"/>
+              <w:spacing w:before="60" w:after="60"/>
             </w:pPr>
             <w:r>
               <w:rPr>
+                <w:rFonts w:ascii="Calibri" w:hAnsi="Calibri"/>
                 <w:b/>
+                <w:color w:val="2C5282"/>
                 <w:sz w:val="20"/>
               </w:rPr>
-              <w:t>Email Address</w:t>
+              <w:t>Project / Paper Title</w:t>
             </w:r>
           </w:p>
         </w:tc>
         <w:tc>
           <w:tcPr>
-            <w:tcW w:type="dxa" w:w="4419"/>
+            <w:tcW w:type="dxa" w:w="4533"/>
+            <w:tcBorders>
+              <w:top w:val="nil"/>
+              <w:left w:val="nil"/>
+              <w:right w:val="nil"/>
+              <w:bottom w:val="single" w:sz="6" w:space="0" w:color="2C5282"/>
+            </w:tcBorders>
           </w:tcPr>
           <w:p>
+            <w:pPr>
+              <w:spacing w:before="60" w:after="60"/>
+            </w:pPr>
             <w:r>
               <w:rPr>
+                <w:rFonts w:ascii="Calibri" w:hAnsi="Calibri"/>
                 <w:i/>
-                <w:color w:val="AAAAAA"/>
-                <w:sz w:val="18"/>
+                <w:color w:val="BBBBBB"/>
+                <w:sz w:val="19"/>
               </w:rPr>
-              <w:t>e.g., zhangsan@university.edu.cn</w:t>
+              <w:t>(if applicable)</w:t>
+            </w:r>
+          </w:p>
+        </w:tc>
+      </w:tr>
+    </w:tbl>
+    <w:p>
+      <w:pPr>
+        <w:spacing w:before="0" w:after="0"/>
+        <w:spacing w:before="60" w:after="0"/>
+      </w:pPr>
+    </w:p>
+    <w:p>
+      <w:pPr>
+        <w:spacing w:before="80" w:after="30"/>
+      </w:pPr>
+      <w:r>
+        <w:rPr>
+          <w:rFonts w:ascii="Calibri" w:hAnsi="Calibri"/>
+          <w:b/>
+          <w:color w:val="2C5282"/>
+          <w:sz w:val="20"/>
+        </w:rPr>
+        <w:t>Detailed Description of Intended Use</w:t>
+      </w:r>
+    </w:p>
+    <w:tbl>
+      <w:tblPr>
+        <w:tblStyle w:val="TableGrid"/>
+        <w:tblW w:type="auto" w:w="0"/>
+        <w:tblLook w:firstColumn="1" w:firstRow="1" w:lastColumn="0" w:lastRow="0" w:noHBand="0" w:noVBand="1" w:val="04A0"/>
+      </w:tblPr>
+      <w:tblGrid>
+        <w:gridCol w:w="9066"/>
+      </w:tblGrid>
+      <w:tr>
+        <w:tc>
+          <w:tcPr>
+            <w:tcW w:type="dxa" w:w="9066"/>
+            <w:tcBorders>
+              <w:top w:val="nil"/>
+              <w:left w:val="nil"/>
+              <w:right w:val="nil"/>
+              <w:insideH w:val="nil"/>
+              <w:insideV w:val="nil"/>
+              <w:bottom w:val="nil"/>
+            </w:tcBorders>
+            <w:shd w:val="clear" w:color="auto" w:fill="F7FAFD"/>
+          </w:tcPr>
+          <w:p>
+            <w:pPr>
+              <w:spacing w:before="60" w:after="0"/>
+            </w:pPr>
+            <w:r>
+              <w:rPr>
+                <w:rFonts w:ascii="Calibri" w:hAnsi="Calibri"/>
+                <w:i/>
+                <w:color w:val="BBBBBB"/>
+                <w:sz w:val="19"/>
+              </w:rPr>
+              <w:t>Please describe your research questions, application scenario, or expected outputs...</w:t>
             </w:r>
           </w:p>
         </w:tc>
@@ -218,13 +840,337 @@
       <w:tr>
         <w:tc>
           <w:tcPr>
-            <w:tcW w:type="dxa" w:w="4419"/>
+            <w:tcW w:type="dxa" w:w="9066"/>
+            <w:tcBorders>
+              <w:top w:val="nil"/>
+              <w:left w:val="nil"/>
+              <w:right w:val="nil"/>
+              <w:insideH w:val="nil"/>
+              <w:insideV w:val="nil"/>
+              <w:bottom w:val="nil"/>
+            </w:tcBorders>
+            <w:shd w:val="clear" w:color="auto" w:fill="F7FAFD"/>
+          </w:tcPr>
+          <w:p>
+            <w:pPr>
+              <w:spacing w:before="60" w:after="0"/>
+            </w:pPr>
+          </w:p>
+        </w:tc>
+      </w:tr>
+      <w:tr>
+        <w:tc>
+          <w:tcPr>
+            <w:tcW w:type="dxa" w:w="9066"/>
+            <w:tcBorders>
+              <w:top w:val="nil"/>
+              <w:left w:val="nil"/>
+              <w:right w:val="nil"/>
+              <w:insideH w:val="nil"/>
+              <w:insideV w:val="nil"/>
+              <w:bottom w:val="nil"/>
+            </w:tcBorders>
+            <w:shd w:val="clear" w:color="auto" w:fill="F7FAFD"/>
+          </w:tcPr>
+          <w:p>
+            <w:pPr>
+              <w:spacing w:before="60" w:after="0"/>
+            </w:pPr>
+          </w:p>
+        </w:tc>
+      </w:tr>
+      <w:tr>
+        <w:tc>
+          <w:tcPr>
+            <w:tcW w:type="dxa" w:w="9066"/>
+            <w:tcBorders>
+              <w:top w:val="nil"/>
+              <w:left w:val="nil"/>
+              <w:right w:val="nil"/>
+              <w:insideH w:val="nil"/>
+              <w:insideV w:val="nil"/>
+              <w:bottom w:val="nil"/>
+            </w:tcBorders>
+            <w:shd w:val="clear" w:color="auto" w:fill="F7FAFD"/>
+          </w:tcPr>
+          <w:p>
+            <w:pPr>
+              <w:spacing w:before="60" w:after="0"/>
+            </w:pPr>
+          </w:p>
+        </w:tc>
+      </w:tr>
+      <w:tr>
+        <w:tc>
+          <w:tcPr>
+            <w:tcW w:type="dxa" w:w="9066"/>
+            <w:tcBorders>
+              <w:top w:val="nil"/>
+              <w:left w:val="nil"/>
+              <w:right w:val="nil"/>
+              <w:insideH w:val="nil"/>
+              <w:insideV w:val="nil"/>
+              <w:bottom w:val="single" w:sz="6" w:color="2C5282"/>
+            </w:tcBorders>
+            <w:shd w:val="clear" w:color="auto" w:fill="F7FAFD"/>
+          </w:tcPr>
+          <w:p>
+            <w:pPr>
+              <w:spacing w:before="60" w:after="0"/>
+            </w:pPr>
+          </w:p>
+        </w:tc>
+      </w:tr>
+    </w:tbl>
+    <w:p>
+      <w:pPr>
+        <w:spacing w:before="0" w:after="0"/>
+        <w:spacing w:before="80" w:after="0"/>
+      </w:pPr>
+    </w:p>
+    <w:p>
+      <w:pPr>
+        <w:spacing w:before="80" w:after="30"/>
+      </w:pPr>
+      <w:r>
+        <w:rPr>
+          <w:rFonts w:ascii="Calibri" w:hAnsi="Calibri"/>
+          <w:b/>
+          <w:color w:val="2C5282"/>
+          <w:sz w:val="20"/>
+        </w:rPr>
+        <w:t>Expected Usage Scale</w:t>
+      </w:r>
+    </w:p>
+    <w:tbl>
+      <w:tblPr>
+        <w:tblStyle w:val="TableGrid"/>
+        <w:tblW w:type="auto" w:w="0"/>
+        <w:tblLook w:firstColumn="1" w:firstRow="1" w:lastColumn="0" w:lastRow="0" w:noHBand="0" w:noVBand="1" w:val="04A0"/>
+      </w:tblPr>
+      <w:tblGrid>
+        <w:gridCol w:w="4533"/>
+        <w:gridCol w:w="4533"/>
+      </w:tblGrid>
+      <w:tr>
+        <w:tc>
+          <w:tcPr>
+            <w:tcW w:type="dxa" w:w="4533"/>
+            <w:tcBorders>
+              <w:top w:val="nil"/>
+              <w:left w:val="nil"/>
+              <w:bottom w:val="nil"/>
+              <w:right w:val="nil"/>
+              <w:insideH w:val="nil"/>
+              <w:insideV w:val="nil"/>
+            </w:tcBorders>
+          </w:tcPr>
+          <w:p>
+            <w:pPr>
+              <w:spacing w:before="50" w:after="50"/>
+            </w:pPr>
+            <w:r>
+              <w:rPr>
+                <w:rFonts w:ascii="Calibri" w:hAnsi="Calibri"/>
+                <w:color w:val="222222"/>
+                <w:sz w:val="20"/>
+              </w:rPr>
+              <w:t>☐   Small-scale exploration / proof-of-concept</w:t>
+            </w:r>
+          </w:p>
+        </w:tc>
+        <w:tc>
+          <w:tcPr>
+            <w:tcW w:type="dxa" w:w="4533"/>
+            <w:tcBorders>
+              <w:top w:val="nil"/>
+              <w:left w:val="nil"/>
+              <w:bottom w:val="nil"/>
+              <w:right w:val="nil"/>
+              <w:insideH w:val="nil"/>
+              <w:insideV w:val="nil"/>
+            </w:tcBorders>
+          </w:tcPr>
+          <w:p>
+            <w:pPr>
+              <w:spacing w:before="50" w:after="50"/>
+            </w:pPr>
+            <w:r>
+              <w:rPr>
+                <w:rFonts w:ascii="Calibri" w:hAnsi="Calibri"/>
+                <w:color w:val="222222"/>
+                <w:sz w:val="20"/>
+              </w:rPr>
+              <w:t>☐   Full dataset for research publication</w:t>
+            </w:r>
+          </w:p>
+        </w:tc>
+      </w:tr>
+      <w:tr>
+        <w:tc>
+          <w:tcPr>
+            <w:tcW w:type="dxa" w:w="4533"/>
+            <w:tcBorders>
+              <w:top w:val="nil"/>
+              <w:left w:val="nil"/>
+              <w:bottom w:val="nil"/>
+              <w:right w:val="nil"/>
+              <w:insideH w:val="nil"/>
+              <w:insideV w:val="nil"/>
+            </w:tcBorders>
+          </w:tcPr>
+          <w:p>
+            <w:pPr>
+              <w:spacing w:before="50" w:after="50"/>
+            </w:pPr>
+            <w:r>
+              <w:rPr>
+                <w:rFonts w:ascii="Calibri" w:hAnsi="Calibri"/>
+                <w:color w:val="222222"/>
+                <w:sz w:val="20"/>
+              </w:rPr>
+              <w:t>☐   Large-scale commercial deployment</w:t>
+            </w:r>
+          </w:p>
+        </w:tc>
+        <w:tc>
+          <w:tcPr>
+            <w:tcW w:type="dxa" w:w="4533"/>
+            <w:tcBorders>
+              <w:top w:val="nil"/>
+              <w:left w:val="nil"/>
+              <w:bottom w:val="nil"/>
+              <w:right w:val="nil"/>
+              <w:insideH w:val="nil"/>
+              <w:insideV w:val="nil"/>
+            </w:tcBorders>
+          </w:tcPr>
+          <w:p>
+            <w:pPr>
+              <w:spacing w:before="50" w:after="50"/>
+            </w:pPr>
+            <w:r>
+              <w:rPr>
+                <w:rFonts w:ascii="Calibri" w:hAnsi="Calibri"/>
+                <w:color w:val="222222"/>
+                <w:sz w:val="20"/>
+              </w:rPr>
+              <w:t>☐   Other: ________________________________</w:t>
+            </w:r>
+          </w:p>
+        </w:tc>
+      </w:tr>
+    </w:tbl>
+    <w:p>
+      <w:pPr>
+        <w:spacing w:before="0" w:after="0"/>
+        <w:spacing w:before="60" w:after="0"/>
+      </w:pPr>
+    </w:p>
+    <w:p>
+      <w:pPr>
+        <w:spacing w:before="80" w:after="30"/>
+      </w:pPr>
+      <w:r>
+        <w:rPr>
+          <w:rFonts w:ascii="Calibri" w:hAnsi="Calibri"/>
+          <w:b/>
+          <w:color w:val="2C5282"/>
+          <w:sz w:val="20"/>
+        </w:rPr>
+        <w:t>Will results / findings be published?</w:t>
+      </w:r>
+    </w:p>
+    <w:tbl>
+      <w:tblPr>
+        <w:tblStyle w:val="TableGrid"/>
+        <w:tblW w:type="auto" w:w="0"/>
+        <w:tblLook w:firstColumn="1" w:firstRow="1" w:lastColumn="0" w:lastRow="0" w:noHBand="0" w:noVBand="1" w:val="04A0"/>
+      </w:tblPr>
+      <w:tblGrid>
+        <w:gridCol w:w="2266"/>
+        <w:gridCol w:w="2266"/>
+        <w:gridCol w:w="2266"/>
+        <w:gridCol w:w="2266"/>
+      </w:tblGrid>
+      <w:tr>
+        <w:tc>
+          <w:tcPr>
+            <w:tcW w:type="dxa" w:w="2266"/>
+            <w:tcBorders>
+              <w:top w:val="nil"/>
+              <w:left w:val="nil"/>
+              <w:bottom w:val="nil"/>
+              <w:right w:val="nil"/>
+              <w:insideH w:val="nil"/>
+              <w:insideV w:val="nil"/>
+            </w:tcBorders>
+          </w:tcPr>
+          <w:p>
+            <w:pPr>
+              <w:spacing w:before="50" w:after="50"/>
+            </w:pPr>
+            <w:r>
+              <w:rPr>
+                <w:rFonts w:ascii="Calibri" w:hAnsi="Calibri"/>
+                <w:color w:val="222222"/>
+                <w:sz w:val="20"/>
+              </w:rPr>
+              <w:t>☐   Yes</w:t>
+            </w:r>
+          </w:p>
+        </w:tc>
+        <w:tc>
+          <w:tcPr>
+            <w:tcW w:type="dxa" w:w="2266"/>
+            <w:tcBorders>
+              <w:top w:val="nil"/>
+              <w:left w:val="nil"/>
+              <w:bottom w:val="nil"/>
+              <w:right w:val="nil"/>
+              <w:insideH w:val="nil"/>
+              <w:insideV w:val="nil"/>
+            </w:tcBorders>
+          </w:tcPr>
+          <w:p>
+            <w:pPr>
+              <w:spacing w:before="50" w:after="50"/>
+            </w:pPr>
+            <w:r>
+              <w:rPr>
+                <w:rFonts w:ascii="Calibri" w:hAnsi="Calibri"/>
+                <w:color w:val="222222"/>
+                <w:sz w:val="20"/>
+              </w:rPr>
+              <w:t>☐   No</w:t>
+            </w:r>
+          </w:p>
+        </w:tc>
+        <w:tc>
+          <w:tcPr>
+            <w:tcW w:type="dxa" w:w="2266"/>
+            <w:tcBorders>
+              <w:top w:val="nil"/>
+              <w:left w:val="nil"/>
+              <w:bottom w:val="nil"/>
+              <w:right w:val="nil"/>
+              <w:insideH w:val="nil"/>
+              <w:insideV w:val="nil"/>
+            </w:tcBorders>
           </w:tcPr>
           <w:p/>
         </w:tc>
         <w:tc>
           <w:tcPr>
-            <w:tcW w:type="dxa" w:w="4419"/>
+            <w:tcW w:type="dxa" w:w="2266"/>
+            <w:tcBorders>
+              <w:top w:val="nil"/>
+              <w:left w:val="nil"/>
+              <w:bottom w:val="nil"/>
+              <w:right w:val="nil"/>
+              <w:insideH w:val="nil"/>
+              <w:insideV w:val="nil"/>
+            </w:tcBorders>
           </w:tcPr>
           <w:p/>
         </w:tc>
@@ -232,7 +1178,8 @@
     </w:tbl>
     <w:p>
       <w:pPr>
-        <w:spacing w:after="80"/>
+        <w:spacing w:before="0" w:after="0"/>
+        <w:spacing w:before="60" w:after="0"/>
       </w:pPr>
     </w:p>
     <w:tbl>
@@ -242,63 +1189,74 @@
         <w:tblLook w:firstColumn="1" w:firstRow="1" w:lastColumn="0" w:lastRow="0" w:noHBand="0" w:noVBand="1" w:val="04A0"/>
       </w:tblPr>
       <w:tblGrid>
-        <w:gridCol w:w="2835"/>
-        <w:gridCol w:w="6520"/>
+        <w:gridCol w:w="2948"/>
+        <w:gridCol w:w="7937"/>
       </w:tblGrid>
       <w:tr>
         <w:tc>
           <w:tcPr>
-            <w:tcW w:type="dxa" w:w="4419"/>
-            <w:shd w:val="clear" w:color="auto" w:fill="F0F4F9"/>
-            <w:vAlign w:val="center"/>
+            <w:tcW w:type="dxa" w:w="4533"/>
+            <w:tcBorders>
+              <w:top w:val="nil"/>
+              <w:left w:val="nil"/>
+              <w:bottom w:val="nil"/>
+              <w:right w:val="nil"/>
+              <w:insideH w:val="nil"/>
+              <w:insideV w:val="nil"/>
+            </w:tcBorders>
           </w:tcPr>
           <w:p>
             <w:pPr>
-              <w:jc w:val="left"/>
+              <w:spacing w:before="60" w:after="60"/>
             </w:pPr>
             <w:r>
               <w:rPr>
+                <w:rFonts w:ascii="Calibri" w:hAnsi="Calibri"/>
                 <w:b/>
+                <w:color w:val="2C5282"/>
                 <w:sz w:val="20"/>
               </w:rPr>
-              <w:t>Institution / Company</w:t>
+              <w:t>Target journal / conference</w:t>
             </w:r>
           </w:p>
         </w:tc>
         <w:tc>
           <w:tcPr>
-            <w:tcW w:type="dxa" w:w="4419"/>
+            <w:tcW w:type="dxa" w:w="4533"/>
+            <w:tcBorders>
+              <w:top w:val="nil"/>
+              <w:left w:val="nil"/>
+              <w:right w:val="nil"/>
+              <w:bottom w:val="single" w:sz="6" w:space="0" w:color="2C5282"/>
+            </w:tcBorders>
           </w:tcPr>
           <w:p>
+            <w:pPr>
+              <w:spacing w:before="60" w:after="60"/>
+            </w:pPr>
             <w:r>
               <w:rPr>
+                <w:rFonts w:ascii="Calibri" w:hAnsi="Calibri"/>
                 <w:i/>
-                <w:color w:val="AAAAAA"/>
-                <w:sz w:val="18"/>
+                <w:color w:val="BBBBBB"/>
+                <w:sz w:val="19"/>
               </w:rPr>
-              <w:t>e.g., Jilin University / Company Name</w:t>
+              <w:t>(if applicable)</w:t>
             </w:r>
           </w:p>
-        </w:tc>
-      </w:tr>
-      <w:tr>
-        <w:tc>
-          <w:tcPr>
-            <w:tcW w:type="dxa" w:w="4419"/>
-          </w:tcPr>
-          <w:p/>
-        </w:tc>
-        <w:tc>
-          <w:tcPr>
-            <w:tcW w:type="dxa" w:w="4419"/>
-          </w:tcPr>
-          <w:p/>
         </w:tc>
       </w:tr>
     </w:tbl>
     <w:p>
       <w:pPr>
-        <w:spacing w:after="80"/>
+        <w:spacing w:before="0" w:after="0"/>
+        <w:spacing w:before="60" w:after="0"/>
+      </w:pPr>
+    </w:p>
+    <w:p>
+      <w:pPr>
+        <w:spacing w:before="0" w:after="0"/>
+        <w:spacing w:before="260" w:after="0"/>
       </w:pPr>
     </w:p>
     <w:tbl>
@@ -308,63 +1266,55 @@
         <w:tblLook w:firstColumn="1" w:firstRow="1" w:lastColumn="0" w:lastRow="0" w:noHBand="0" w:noVBand="1" w:val="04A0"/>
       </w:tblPr>
       <w:tblGrid>
-        <w:gridCol w:w="2835"/>
-        <w:gridCol w:w="6520"/>
+        <w:gridCol w:w="9066"/>
       </w:tblGrid>
       <w:tr>
+        <w:trPr>
+          <w:trHeight w:val="420"/>
+        </w:trPr>
         <w:tc>
           <w:tcPr>
-            <w:tcW w:type="dxa" w:w="4419"/>
-            <w:shd w:val="clear" w:color="auto" w:fill="F0F4F9"/>
-            <w:vAlign w:val="center"/>
+            <w:tcW w:type="dxa" w:w="9066"/>
+            <w:shd w:val="clear" w:color="auto" w:fill="2C5282"/>
+            <w:tcBorders>
+              <w:top w:val="nil"/>
+              <w:left w:val="nil"/>
+              <w:bottom w:val="nil"/>
+              <w:right w:val="nil"/>
+              <w:insideH w:val="nil"/>
+              <w:insideV w:val="nil"/>
+            </w:tcBorders>
           </w:tcPr>
           <w:p>
             <w:pPr>
               <w:jc w:val="left"/>
+              <w:spacing w:before="60" w:after="60"/>
             </w:pPr>
             <w:r>
               <w:rPr>
+                <w:rFonts w:ascii="Calibri" w:hAnsi="Calibri"/>
                 <w:b/>
+                <w:color w:val="B0C8E8"/>
                 <w:sz w:val="20"/>
               </w:rPr>
-              <w:t>Department / Team</w:t>
+              <w:t xml:space="preserve">  03  </w:t>
+            </w:r>
+            <w:r>
+              <w:rPr>
+                <w:rFonts w:ascii="Calibri" w:hAnsi="Calibri"/>
+                <w:b/>
+                <w:color w:val="FFFFFF"/>
+                <w:sz w:val="22"/>
+              </w:rPr>
+              <w:t>Acknowledgement</w:t>
             </w:r>
           </w:p>
-        </w:tc>
-        <w:tc>
-          <w:tcPr>
-            <w:tcW w:type="dxa" w:w="4419"/>
-          </w:tcPr>
-          <w:p>
-            <w:r>
-              <w:rPr>
-                <w:i/>
-                <w:color w:val="AAAAAA"/>
-                <w:sz w:val="18"/>
-              </w:rPr>
-              <w:t>(optional)</w:t>
-            </w:r>
-          </w:p>
-        </w:tc>
-      </w:tr>
-      <w:tr>
-        <w:tc>
-          <w:tcPr>
-            <w:tcW w:type="dxa" w:w="4419"/>
-          </w:tcPr>
-          <w:p/>
-        </w:tc>
-        <w:tc>
-          <w:tcPr>
-            <w:tcW w:type="dxa" w:w="4419"/>
-          </w:tcPr>
-          <w:p/>
         </w:tc>
       </w:tr>
     </w:tbl>
     <w:p>
       <w:pPr>
-        <w:spacing w:after="80"/>
+        <w:spacing w:before="0" w:after="0"/>
       </w:pPr>
     </w:p>
     <w:tbl>
@@ -374,203 +1324,71 @@
         <w:tblLook w:firstColumn="1" w:firstRow="1" w:lastColumn="0" w:lastRow="0" w:noHBand="0" w:noVBand="1" w:val="04A0"/>
       </w:tblPr>
       <w:tblGrid>
-        <w:gridCol w:w="2835"/>
-        <w:gridCol w:w="6520"/>
+        <w:gridCol w:w="680"/>
+        <w:gridCol w:w="9638"/>
       </w:tblGrid>
       <w:tr>
         <w:tc>
           <w:tcPr>
-            <w:tcW w:type="dxa" w:w="4419"/>
-            <w:shd w:val="clear" w:color="auto" w:fill="F0F4F9"/>
-            <w:vAlign w:val="center"/>
+            <w:tcW w:type="dxa" w:w="4533"/>
+            <w:tcBorders>
+              <w:top w:val="nil"/>
+              <w:left w:val="nil"/>
+              <w:bottom w:val="nil"/>
+              <w:right w:val="nil"/>
+              <w:insideH w:val="nil"/>
+              <w:insideV w:val="nil"/>
+            </w:tcBorders>
+            <w:shd w:val="clear" w:color="auto" w:fill="F0F5FB"/>
           </w:tcPr>
           <w:p>
             <w:pPr>
-              <w:jc w:val="left"/>
+              <w:spacing w:before="80" w:after="80"/>
+              <w:jc w:val="center"/>
             </w:pPr>
             <w:r>
               <w:rPr>
-                <w:b/>
-                <w:sz w:val="20"/>
+                <w:rFonts w:ascii="Calibri" w:hAnsi="Calibri"/>
+                <w:color w:val="2C5282"/>
+                <w:sz w:val="26"/>
               </w:rPr>
-              <w:t>Country / Region</w:t>
+              <w:t>☐</w:t>
             </w:r>
           </w:p>
         </w:tc>
         <w:tc>
           <w:tcPr>
-            <w:tcW w:type="dxa" w:w="4419"/>
+            <w:tcW w:type="dxa" w:w="4533"/>
+            <w:tcBorders>
+              <w:top w:val="nil"/>
+              <w:left w:val="nil"/>
+              <w:bottom w:val="nil"/>
+              <w:right w:val="nil"/>
+              <w:insideH w:val="nil"/>
+              <w:insideV w:val="nil"/>
+            </w:tcBorders>
+            <w:shd w:val="clear" w:color="auto" w:fill="F0F5FB"/>
           </w:tcPr>
           <w:p>
+            <w:pPr>
+              <w:spacing w:before="80" w:after="80"/>
+            </w:pPr>
             <w:r>
               <w:rPr>
-                <w:i/>
-                <w:color w:val="AAAAAA"/>
-                <w:sz w:val="18"/>
+                <w:rFonts w:ascii="Calibri" w:hAnsi="Calibri"/>
+                <w:color w:val="222222"/>
+                <w:sz w:val="20"/>
               </w:rPr>
-              <w:t>e.g., China</w:t>
+              <w:t>I will use VRUD solely for the purpose described above.</w:t>
             </w:r>
           </w:p>
-        </w:tc>
-      </w:tr>
-      <w:tr>
-        <w:tc>
-          <w:tcPr>
-            <w:tcW w:type="dxa" w:w="4419"/>
-          </w:tcPr>
-          <w:p/>
-        </w:tc>
-        <w:tc>
-          <w:tcPr>
-            <w:tcW w:type="dxa" w:w="4419"/>
-          </w:tcPr>
-          <w:p/>
         </w:tc>
       </w:tr>
     </w:tbl>
     <w:p>
       <w:pPr>
-        <w:spacing w:after="80"/>
-      </w:pPr>
-    </w:p>
-    <w:p>
-      <w:pPr>
-        <w:spacing w:before="120" w:after="40"/>
-        <w:pBdr>
-          <w:bottom w:val="single" w:sz="4" w:space="1" w:color="1A56A0"/>
-        </w:pBdr>
-      </w:pPr>
-      <w:r>
-        <w:rPr>
-          <w:b/>
-          <w:color w:val="1A56A0"/>
-          <w:sz w:val="22"/>
-        </w:rPr>
-        <w:t>2.  Intended Use</w:t>
-      </w:r>
-    </w:p>
-    <w:p>
-      <w:r>
-        <w:rPr>
-          <w:b/>
-          <w:sz w:val="20"/>
-        </w:rPr>
-        <w:t>Primary Purpose:</w:t>
-      </w:r>
-    </w:p>
-    <w:p>
-      <w:pPr>
-        <w:pStyle w:val="ListBullet"/>
-        <w:ind w:left="567"/>
-      </w:pPr>
-      <w:r>
-        <w:rPr>
-          <w:sz w:val="20"/>
-        </w:rPr>
-        <w:t>☐  Academic Research</w:t>
-      </w:r>
-    </w:p>
-    <w:p>
-      <w:pPr>
-        <w:pStyle w:val="ListBullet"/>
-        <w:ind w:left="567"/>
-      </w:pPr>
-      <w:r>
-        <w:rPr>
-          <w:sz w:val="20"/>
-        </w:rPr>
-        <w:t>☐  Industrial / Commercial Application</w:t>
-      </w:r>
-    </w:p>
-    <w:p>
-      <w:pPr>
-        <w:pStyle w:val="ListBullet"/>
-        <w:ind w:left="567"/>
-      </w:pPr>
-      <w:r>
-        <w:rPr>
-          <w:sz w:val="20"/>
-        </w:rPr>
-        <w:t>☐  Teaching / Course Material</w:t>
-      </w:r>
-    </w:p>
-    <w:p>
-      <w:pPr>
-        <w:pStyle w:val="ListBullet"/>
-        <w:ind w:left="567"/>
-      </w:pPr>
-      <w:r>
-        <w:rPr>
-          <w:sz w:val="20"/>
-        </w:rPr>
-        <w:t>☐  Other: ___________________________</w:t>
-      </w:r>
-    </w:p>
-    <w:p/>
-    <w:tbl>
-      <w:tblPr>
-        <w:tblStyle w:val="TableGrid"/>
-        <w:tblW w:type="auto" w:w="0"/>
-        <w:tblLook w:firstColumn="1" w:firstRow="1" w:lastColumn="0" w:lastRow="0" w:noHBand="0" w:noVBand="1" w:val="04A0"/>
-      </w:tblPr>
-      <w:tblGrid>
-        <w:gridCol w:w="2835"/>
-        <w:gridCol w:w="6520"/>
-      </w:tblGrid>
-      <w:tr>
-        <w:tc>
-          <w:tcPr>
-            <w:tcW w:type="dxa" w:w="4419"/>
-            <w:shd w:val="clear" w:color="auto" w:fill="F0F4F9"/>
-            <w:vAlign w:val="center"/>
-          </w:tcPr>
-          <w:p>
-            <w:pPr>
-              <w:jc w:val="left"/>
-            </w:pPr>
-            <w:r>
-              <w:rPr>
-                <w:b/>
-                <w:sz w:val="20"/>
-              </w:rPr>
-              <w:t>Project / Paper Title</w:t>
-            </w:r>
-          </w:p>
-        </w:tc>
-        <w:tc>
-          <w:tcPr>
-            <w:tcW w:type="dxa" w:w="4419"/>
-          </w:tcPr>
-          <w:p>
-            <w:r>
-              <w:rPr>
-                <w:i/>
-                <w:color w:val="AAAAAA"/>
-                <w:sz w:val="18"/>
-              </w:rPr>
-              <w:t>(if applicable)</w:t>
-            </w:r>
-          </w:p>
-        </w:tc>
-      </w:tr>
-      <w:tr>
-        <w:tc>
-          <w:tcPr>
-            <w:tcW w:type="dxa" w:w="4419"/>
-          </w:tcPr>
-          <w:p/>
-        </w:tc>
-        <w:tc>
-          <w:tcPr>
-            <w:tcW w:type="dxa" w:w="4419"/>
-          </w:tcPr>
-          <w:p/>
-        </w:tc>
-      </w:tr>
-    </w:tbl>
-    <w:p>
-      <w:pPr>
-        <w:spacing w:after="80"/>
+        <w:spacing w:before="0" w:after="0"/>
+        <w:spacing w:before="50" w:after="0"/>
       </w:pPr>
     </w:p>
     <w:tbl>
@@ -580,291 +1398,282 @@
         <w:tblLook w:firstColumn="1" w:firstRow="1" w:lastColumn="0" w:lastRow="0" w:noHBand="0" w:noVBand="1" w:val="04A0"/>
       </w:tblPr>
       <w:tblGrid>
-        <w:gridCol w:w="2835"/>
-        <w:gridCol w:w="6520"/>
+        <w:gridCol w:w="680"/>
+        <w:gridCol w:w="9638"/>
       </w:tblGrid>
       <w:tr>
         <w:tc>
           <w:tcPr>
-            <w:tcW w:type="dxa" w:w="4419"/>
-            <w:vMerge w:val="restart"/>
-            <w:shd w:val="clear" w:color="auto" w:fill="F0F4F9"/>
-            <w:vAlign w:val="top"/>
+            <w:tcW w:type="dxa" w:w="4533"/>
+            <w:tcBorders>
+              <w:top w:val="nil"/>
+              <w:left w:val="nil"/>
+              <w:bottom w:val="nil"/>
+              <w:right w:val="nil"/>
+              <w:insideH w:val="nil"/>
+              <w:insideV w:val="nil"/>
+            </w:tcBorders>
+            <w:shd w:val="clear" w:color="auto" w:fill="F0F5FB"/>
           </w:tcPr>
           <w:p>
+            <w:pPr>
+              <w:spacing w:before="80" w:after="80"/>
+              <w:jc w:val="center"/>
+            </w:pPr>
             <w:r>
               <w:rPr>
-                <w:b/>
-                <w:sz w:val="20"/>
+                <w:rFonts w:ascii="Calibri" w:hAnsi="Calibri"/>
+                <w:color w:val="2C5282"/>
+                <w:sz w:val="26"/>
               </w:rPr>
-              <w:t>Detailed Description</w:t>
-              <w:br/>
-              <w:t>of Intended Use</w:t>
-            </w:r>
-          </w:p>
-          <w:p>
-            <w:r>
-              <w:rPr>
-                <w:i/>
-                <w:color w:val="777777"/>
-                <w:sz w:val="17"/>
-              </w:rPr>
-              <w:t>(Please describe clearly</w:t>
-              <w:br/>
-              <w:t>to speed up processing)</w:t>
+              <w:t>☐</w:t>
             </w:r>
           </w:p>
         </w:tc>
         <w:tc>
           <w:tcPr>
-            <w:tcW w:type="dxa" w:w="4419"/>
+            <w:tcW w:type="dxa" w:w="4533"/>
+            <w:tcBorders>
+              <w:top w:val="nil"/>
+              <w:left w:val="nil"/>
+              <w:bottom w:val="nil"/>
+              <w:right w:val="nil"/>
+              <w:insideH w:val="nil"/>
+              <w:insideV w:val="nil"/>
+            </w:tcBorders>
+            <w:shd w:val="clear" w:color="auto" w:fill="F0F5FB"/>
           </w:tcPr>
           <w:p>
+            <w:pPr>
+              <w:spacing w:before="80" w:after="80"/>
+            </w:pPr>
             <w:r>
               <w:rPr>
-                <w:i/>
-                <w:color w:val="AAAAAA"/>
-                <w:sz w:val="18"/>
+                <w:rFonts w:ascii="Calibri" w:hAnsi="Calibri"/>
+                <w:color w:val="222222"/>
+                <w:sz w:val="20"/>
               </w:rPr>
-              <w:t>e.g., research questions, application scenario, expected outputs...</w:t>
+              <w:t>I will include proper citation in any publications using VRUD.</w:t>
             </w:r>
           </w:p>
-        </w:tc>
-      </w:tr>
-      <w:tr>
-        <w:tc>
-          <w:tcPr>
-            <w:tcW w:type="dxa" w:w="4419"/>
-            <w:vMerge/>
-          </w:tcPr>
-          <w:p/>
-        </w:tc>
-        <w:tc>
-          <w:tcPr>
-            <w:tcW w:type="dxa" w:w="4419"/>
-          </w:tcPr>
-          <w:p/>
-        </w:tc>
-      </w:tr>
-      <w:tr>
-        <w:tc>
-          <w:tcPr>
-            <w:tcW w:type="dxa" w:w="4419"/>
-            <w:vMerge/>
-          </w:tcPr>
-          <w:p/>
-        </w:tc>
-        <w:tc>
-          <w:tcPr>
-            <w:tcW w:type="dxa" w:w="4419"/>
-          </w:tcPr>
-          <w:p/>
-        </w:tc>
-      </w:tr>
-      <w:tr>
-        <w:tc>
-          <w:tcPr>
-            <w:tcW w:type="dxa" w:w="4419"/>
-            <w:vMerge/>
-          </w:tcPr>
-          <w:p/>
-        </w:tc>
-        <w:tc>
-          <w:tcPr>
-            <w:tcW w:type="dxa" w:w="4419"/>
-          </w:tcPr>
-          <w:p/>
-        </w:tc>
-      </w:tr>
-      <w:tr>
-        <w:tc>
-          <w:tcPr>
-            <w:tcW w:type="dxa" w:w="4419"/>
-            <w:vMerge/>
-          </w:tcPr>
-          <w:p/>
-        </w:tc>
-        <w:tc>
-          <w:tcPr>
-            <w:tcW w:type="dxa" w:w="4419"/>
-          </w:tcPr>
-          <w:p/>
-        </w:tc>
-      </w:tr>
-      <w:tr>
-        <w:tc>
-          <w:tcPr>
-            <w:tcW w:type="dxa" w:w="4419"/>
-            <w:vMerge/>
-          </w:tcPr>
-          <w:p/>
-        </w:tc>
-        <w:tc>
-          <w:tcPr>
-            <w:tcW w:type="dxa" w:w="4419"/>
-          </w:tcPr>
-          <w:p/>
         </w:tc>
       </w:tr>
     </w:tbl>
     <w:p>
       <w:pPr>
-        <w:spacing w:after="80"/>
+        <w:spacing w:before="0" w:after="0"/>
+        <w:spacing w:before="50" w:after="0"/>
+      </w:pPr>
+    </w:p>
+    <w:tbl>
+      <w:tblPr>
+        <w:tblStyle w:val="TableGrid"/>
+        <w:tblW w:type="auto" w:w="0"/>
+        <w:tblLook w:firstColumn="1" w:firstRow="1" w:lastColumn="0" w:lastRow="0" w:noHBand="0" w:noVBand="1" w:val="04A0"/>
+      </w:tblPr>
+      <w:tblGrid>
+        <w:gridCol w:w="680"/>
+        <w:gridCol w:w="9638"/>
+      </w:tblGrid>
+      <w:tr>
+        <w:tc>
+          <w:tcPr>
+            <w:tcW w:type="dxa" w:w="4533"/>
+            <w:tcBorders>
+              <w:top w:val="nil"/>
+              <w:left w:val="nil"/>
+              <w:bottom w:val="nil"/>
+              <w:right w:val="nil"/>
+              <w:insideH w:val="nil"/>
+              <w:insideV w:val="nil"/>
+            </w:tcBorders>
+            <w:shd w:val="clear" w:color="auto" w:fill="F0F5FB"/>
+          </w:tcPr>
+          <w:p>
+            <w:pPr>
+              <w:spacing w:before="80" w:after="80"/>
+              <w:jc w:val="center"/>
+            </w:pPr>
+            <w:r>
+              <w:rPr>
+                <w:rFonts w:ascii="Calibri" w:hAnsi="Calibri"/>
+                <w:color w:val="2C5282"/>
+                <w:sz w:val="26"/>
+              </w:rPr>
+              <w:t>☐</w:t>
+            </w:r>
+          </w:p>
+        </w:tc>
+        <w:tc>
+          <w:tcPr>
+            <w:tcW w:type="dxa" w:w="4533"/>
+            <w:tcBorders>
+              <w:top w:val="nil"/>
+              <w:left w:val="nil"/>
+              <w:bottom w:val="nil"/>
+              <w:right w:val="nil"/>
+              <w:insideH w:val="nil"/>
+              <w:insideV w:val="nil"/>
+            </w:tcBorders>
+            <w:shd w:val="clear" w:color="auto" w:fill="F0F5FB"/>
+          </w:tcPr>
+          <w:p>
+            <w:pPr>
+              <w:spacing w:before="80" w:after="80"/>
+            </w:pPr>
+            <w:r>
+              <w:rPr>
+                <w:rFonts w:ascii="Calibri" w:hAnsi="Calibri"/>
+                <w:color w:val="222222"/>
+                <w:sz w:val="20"/>
+              </w:rPr>
+              <w:t>I will not redistribute the raw dataset without prior written permission.</w:t>
+            </w:r>
+          </w:p>
+        </w:tc>
+      </w:tr>
+    </w:tbl>
+    <w:p>
+      <w:pPr>
+        <w:spacing w:before="0" w:after="0"/>
+        <w:spacing w:before="50" w:after="0"/>
       </w:pPr>
     </w:p>
     <w:p>
-      <w:r>
-        <w:rPr>
-          <w:b/>
-          <w:sz w:val="20"/>
-        </w:rPr>
-        <w:t>Expected Usage Scale:</w:t>
-      </w:r>
+      <w:pPr>
+        <w:spacing w:before="0" w:after="0"/>
+        <w:spacing w:before="180" w:after="0"/>
+      </w:pPr>
     </w:p>
+    <w:tbl>
+      <w:tblPr>
+        <w:tblStyle w:val="TableGrid"/>
+        <w:tblW w:type="auto" w:w="0"/>
+        <w:tblLook w:firstColumn="1" w:firstRow="1" w:lastColumn="0" w:lastRow="0" w:noHBand="0" w:noVBand="1" w:val="04A0"/>
+      </w:tblPr>
+      <w:tblGrid>
+        <w:gridCol w:w="4533"/>
+        <w:gridCol w:w="4533"/>
+      </w:tblGrid>
+      <w:tr>
+        <w:tc>
+          <w:tcPr>
+            <w:tcW w:type="dxa" w:w="4533"/>
+            <w:tcBorders>
+              <w:top w:val="nil"/>
+              <w:left w:val="nil"/>
+              <w:bottom w:val="nil"/>
+              <w:right w:val="nil"/>
+              <w:insideH w:val="nil"/>
+              <w:insideV w:val="nil"/>
+            </w:tcBorders>
+            <w:tcBorders>
+              <w:top w:val="nil"/>
+              <w:left w:val="nil"/>
+              <w:right w:val="nil"/>
+              <w:bottom w:val="single" w:sz="6" w:space="0" w:color="2C5282"/>
+            </w:tcBorders>
+          </w:tcPr>
+          <w:p>
+            <w:pPr>
+              <w:spacing w:before="60" w:after="60"/>
+            </w:pPr>
+            <w:r>
+              <w:rPr>
+                <w:rFonts w:ascii="Calibri" w:hAnsi="Calibri"/>
+                <w:b/>
+                <w:color w:val="2C5282"/>
+                <w:sz w:val="20"/>
+              </w:rPr>
+              <w:t>Signature:</w:t>
+            </w:r>
+          </w:p>
+        </w:tc>
+        <w:tc>
+          <w:tcPr>
+            <w:tcW w:type="dxa" w:w="4533"/>
+            <w:tcBorders>
+              <w:top w:val="nil"/>
+              <w:left w:val="nil"/>
+              <w:bottom w:val="nil"/>
+              <w:right w:val="nil"/>
+              <w:insideH w:val="nil"/>
+              <w:insideV w:val="nil"/>
+            </w:tcBorders>
+            <w:tcBorders>
+              <w:top w:val="nil"/>
+              <w:left w:val="nil"/>
+              <w:right w:val="nil"/>
+              <w:bottom w:val="single" w:sz="6" w:space="0" w:color="2C5282"/>
+            </w:tcBorders>
+          </w:tcPr>
+          <w:p>
+            <w:pPr>
+              <w:spacing w:before="60" w:after="60"/>
+            </w:pPr>
+            <w:r>
+              <w:rPr>
+                <w:rFonts w:ascii="Calibri" w:hAnsi="Calibri"/>
+                <w:b/>
+                <w:color w:val="2C5282"/>
+                <w:sz w:val="20"/>
+              </w:rPr>
+              <w:t>Date:</w:t>
+            </w:r>
+          </w:p>
+        </w:tc>
+      </w:tr>
+    </w:tbl>
     <w:p>
       <w:pPr>
-        <w:pStyle w:val="ListBullet"/>
-        <w:ind w:left="567"/>
+        <w:spacing w:before="0" w:after="0"/>
+        <w:spacing w:before="220" w:after="0"/>
       </w:pPr>
-      <w:r>
-        <w:rPr>
-          <w:sz w:val="20"/>
-        </w:rPr>
-        <w:t>☐  Small-scale exploration / proof-of-concept</w:t>
-      </w:r>
     </w:p>
-    <w:p>
-      <w:pPr>
-        <w:pStyle w:val="ListBullet"/>
-        <w:ind w:left="567"/>
-      </w:pPr>
-      <w:r>
-        <w:rPr>
-          <w:sz w:val="20"/>
-        </w:rPr>
-        <w:t>☐  Full dataset for research publication</w:t>
-      </w:r>
-    </w:p>
-    <w:p>
-      <w:pPr>
-        <w:pStyle w:val="ListBullet"/>
-        <w:ind w:left="567"/>
-      </w:pPr>
-      <w:r>
-        <w:rPr>
-          <w:sz w:val="20"/>
-        </w:rPr>
-        <w:t>☐  Large-scale commercial deployment</w:t>
-      </w:r>
-    </w:p>
-    <w:p>
-      <w:pPr>
-        <w:pStyle w:val="ListBullet"/>
-        <w:ind w:left="567"/>
-      </w:pPr>
-      <w:r>
-        <w:rPr>
-          <w:sz w:val="20"/>
-        </w:rPr>
-        <w:t>☐  Other: ___________________________</w:t>
-      </w:r>
-    </w:p>
-    <w:p/>
-    <w:p>
-      <w:r>
-        <w:rPr>
-          <w:sz w:val="20"/>
-        </w:rPr>
-        <w:t>Will results / findings be published?      ☐ Yes      ☐ No</w:t>
-      </w:r>
-    </w:p>
-    <w:p>
-      <w:r>
-        <w:rPr>
-          <w:sz w:val="20"/>
-        </w:rPr>
-        <w:t>Target journal / conference (if yes): ___________________________________________</w:t>
-      </w:r>
-    </w:p>
-    <w:p/>
-    <w:p>
-      <w:pPr>
-        <w:spacing w:before="120" w:after="40"/>
-        <w:pBdr>
-          <w:bottom w:val="single" w:sz="4" w:space="1" w:color="1A56A0"/>
-        </w:pBdr>
-      </w:pPr>
-      <w:r>
-        <w:rPr>
-          <w:b/>
-          <w:color w:val="1A56A0"/>
-          <w:sz w:val="22"/>
-        </w:rPr>
-        <w:t>3.  Acknowledgement</w:t>
-      </w:r>
-    </w:p>
-    <w:p>
-      <w:pPr>
-        <w:pStyle w:val="ListBullet"/>
-        <w:ind w:left="567"/>
-      </w:pPr>
-      <w:r>
-        <w:rPr>
-          <w:sz w:val="20"/>
-        </w:rPr>
-        <w:t>☐  I will use VRUD solely for the purpose described above.</w:t>
-      </w:r>
-    </w:p>
-    <w:p>
-      <w:pPr>
-        <w:pStyle w:val="ListBullet"/>
-        <w:ind w:left="567"/>
-      </w:pPr>
-      <w:r>
-        <w:rPr>
-          <w:sz w:val="20"/>
-        </w:rPr>
-        <w:t>☐  I will include proper citation in any publications using VRUD.</w:t>
-      </w:r>
-    </w:p>
-    <w:p>
-      <w:pPr>
-        <w:pStyle w:val="ListBullet"/>
-        <w:ind w:left="567"/>
-      </w:pPr>
-      <w:r>
-        <w:rPr>
-          <w:sz w:val="20"/>
-        </w:rPr>
-        <w:t>☐  I will not redistribute the raw dataset without prior written permission.</w:t>
-      </w:r>
-    </w:p>
-    <w:p/>
-    <w:p>
-      <w:r>
-        <w:rPr>
-          <w:sz w:val="20"/>
-        </w:rPr>
-        <w:t>Signature / Date: _______________________________________________</w:t>
-      </w:r>
-    </w:p>
-    <w:p/>
-    <w:p>
-      <w:pPr>
-        <w:jc w:val="center"/>
-      </w:pPr>
-      <w:r>
-        <w:rPr>
-          <w:i/>
-          <w:color w:val="777777"/>
-          <w:sz w:val="18"/>
-        </w:rPr>
-        <w:t>Thank you for your interest in VRUD!  We will respond as soon as possible.</w:t>
-      </w:r>
-    </w:p>
+    <w:tbl>
+      <w:tblPr>
+        <w:tblStyle w:val="TableGrid"/>
+        <w:tblW w:type="auto" w:w="0"/>
+        <w:tblLook w:firstColumn="1" w:firstRow="1" w:lastColumn="0" w:lastRow="0" w:noHBand="0" w:noVBand="1" w:val="04A0"/>
+      </w:tblPr>
+      <w:tblGrid>
+        <w:gridCol w:w="9066"/>
+      </w:tblGrid>
+      <w:tr>
+        <w:tc>
+          <w:tcPr>
+            <w:tcW w:type="dxa" w:w="9066"/>
+            <w:shd w:val="clear" w:color="auto" w:fill="EBF3FB"/>
+            <w:tcBorders>
+              <w:top w:val="nil"/>
+              <w:left w:val="nil"/>
+              <w:bottom w:val="nil"/>
+              <w:right w:val="nil"/>
+              <w:insideH w:val="nil"/>
+              <w:insideV w:val="nil"/>
+            </w:tcBorders>
+          </w:tcPr>
+          <w:p>
+            <w:pPr>
+              <w:jc w:val="center"/>
+              <w:spacing w:before="80" w:after="80"/>
+            </w:pPr>
+            <w:r>
+              <w:rPr>
+                <w:rFonts w:ascii="Calibri" w:hAnsi="Calibri"/>
+                <w:i/>
+                <w:color w:val="446688"/>
+                <w:sz w:val="19"/>
+              </w:rPr>
+              <w:t>Thank you for your interest in VRUD.  We will respond as soon as possible.</w:t>
+            </w:r>
+          </w:p>
+        </w:tc>
+      </w:tr>
+    </w:tbl>
     <w:sectPr>
       <w:pgSz w:w="12240" w:h="15840"/>
-      <w:pgMar w:top="1417" w:right="1701" w:bottom="1417" w:left="1701" w:header="720" w:footer="720" w:gutter="0"/>
+      <w:pgMar w:top="1247" w:right="1587" w:bottom="1247" w:left="1587" w:header="720" w:footer="720" w:gutter="0"/>
       <w:cols w:space="720"/>
       <w:docGrid w:linePitch="360"/>
     </w:sectPr>

</xml_diff>

<commit_message>
Simplify access form and add GitHub Issue template
- Add .github/ISSUE_TEMPLATE/data_access_request.yml with required fields:
  Full Name, Institution/Company, Detailed Description, Acknowledgement
- Simplify Word form to same four fields only
- Update Data Access Application section in README and index.html to offer
  both GitHub Issue and Word form as parallel options

Co-Authored-By: Claude Sonnet 4.6 <noreply@anthropic.com>
</commit_message>
<xml_diff>
--- a/VRUD_Access_Application_Form.docx
+++ b/VRUD_Access_Application_Form.docx
@@ -87,15 +87,13 @@
           <w:p>
             <w:pPr>
               <w:jc w:val="center"/>
-              <w:spacing w:before="100" w:after="100"/>
+              <w:spacing w:before="100" w:after="60"/>
             </w:pPr>
             <w:r>
               <w:rPr>
-                <w:rFonts w:ascii="Calibri" w:hAnsi="Calibri"/>
-                <w:color w:val="444444"/>
                 <w:sz w:val="20"/>
               </w:rPr>
-              <w:t xml:space="preserve">Please complete all fields and email this document to:   </w:t>
+              <w:t xml:space="preserve">Send completed form to:   </w:t>
             </w:r>
             <w:r>
               <w:rPr>
@@ -119,7 +117,7 @@
                 <w:color w:val="666666"/>
                 <w:sz w:val="19"/>
               </w:rPr>
-              <w:t>Subject line:  [VRUD Access Request]  &lt;Your Name&gt;</w:t>
+              <w:t>Subject: [VRUD Access Request] &lt;Your Name&gt;</w:t>
             </w:r>
           </w:p>
         </w:tc>
@@ -127,456 +125,7 @@
     </w:tbl>
     <w:p>
       <w:pPr>
-        <w:spacing w:before="0" w:after="0"/>
-        <w:spacing w:before="260" w:after="0"/>
-      </w:pPr>
-    </w:p>
-    <w:tbl>
-      <w:tblPr>
-        <w:tblStyle w:val="TableGrid"/>
-        <w:tblW w:type="auto" w:w="0"/>
-        <w:tblLook w:firstColumn="1" w:firstRow="1" w:lastColumn="0" w:lastRow="0" w:noHBand="0" w:noVBand="1" w:val="04A0"/>
-      </w:tblPr>
-      <w:tblGrid>
-        <w:gridCol w:w="9066"/>
-      </w:tblGrid>
-      <w:tr>
-        <w:trPr>
-          <w:trHeight w:val="420"/>
-        </w:trPr>
-        <w:tc>
-          <w:tcPr>
-            <w:tcW w:type="dxa" w:w="9066"/>
-            <w:shd w:val="clear" w:color="auto" w:fill="2C5282"/>
-            <w:tcBorders>
-              <w:top w:val="nil"/>
-              <w:left w:val="nil"/>
-              <w:bottom w:val="nil"/>
-              <w:right w:val="nil"/>
-              <w:insideH w:val="nil"/>
-              <w:insideV w:val="nil"/>
-            </w:tcBorders>
-          </w:tcPr>
-          <w:p>
-            <w:pPr>
-              <w:jc w:val="left"/>
-              <w:spacing w:before="60" w:after="60"/>
-            </w:pPr>
-            <w:r>
-              <w:rPr>
-                <w:rFonts w:ascii="Calibri" w:hAnsi="Calibri"/>
-                <w:b/>
-                <w:color w:val="B0C8E8"/>
-                <w:sz w:val="20"/>
-              </w:rPr>
-              <w:t xml:space="preserve">  01  </w:t>
-            </w:r>
-            <w:r>
-              <w:rPr>
-                <w:rFonts w:ascii="Calibri" w:hAnsi="Calibri"/>
-                <w:b/>
-                <w:color w:val="FFFFFF"/>
-                <w:sz w:val="22"/>
-              </w:rPr>
-              <w:t>Applicant Information</w:t>
-            </w:r>
-          </w:p>
-        </w:tc>
-      </w:tr>
-    </w:tbl>
-    <w:p>
-      <w:pPr>
-        <w:spacing w:before="0" w:after="0"/>
-      </w:pPr>
-    </w:p>
-    <w:tbl>
-      <w:tblPr>
-        <w:tblStyle w:val="TableGrid"/>
-        <w:tblW w:type="auto" w:w="0"/>
-        <w:tblLook w:firstColumn="1" w:firstRow="1" w:lastColumn="0" w:lastRow="0" w:noHBand="0" w:noVBand="1" w:val="04A0"/>
-      </w:tblPr>
-      <w:tblGrid>
-        <w:gridCol w:w="2154"/>
-        <w:gridCol w:w="3288"/>
-        <w:gridCol w:w="2154"/>
-        <w:gridCol w:w="3288"/>
-      </w:tblGrid>
-      <w:tr>
-        <w:tc>
-          <w:tcPr>
-            <w:tcW w:type="dxa" w:w="2266"/>
-            <w:tcBorders>
-              <w:top w:val="nil"/>
-              <w:left w:val="nil"/>
-              <w:bottom w:val="nil"/>
-              <w:right w:val="nil"/>
-              <w:insideH w:val="nil"/>
-              <w:insideV w:val="nil"/>
-            </w:tcBorders>
-          </w:tcPr>
-          <w:p>
-            <w:pPr>
-              <w:spacing w:before="60" w:after="60"/>
-            </w:pPr>
-            <w:r>
-              <w:rPr>
-                <w:rFonts w:ascii="Calibri" w:hAnsi="Calibri"/>
-                <w:b/>
-                <w:color w:val="2C5282"/>
-                <w:sz w:val="20"/>
-              </w:rPr>
-              <w:t>Full Name</w:t>
-            </w:r>
-          </w:p>
-        </w:tc>
-        <w:tc>
-          <w:tcPr>
-            <w:tcW w:type="dxa" w:w="2266"/>
-            <w:tcBorders>
-              <w:top w:val="nil"/>
-              <w:left w:val="nil"/>
-              <w:right w:val="nil"/>
-              <w:bottom w:val="single" w:sz="6" w:space="0" w:color="2C5282"/>
-            </w:tcBorders>
-          </w:tcPr>
-          <w:p>
-            <w:pPr>
-              <w:spacing w:before="60" w:after="60"/>
-            </w:pPr>
-            <w:r>
-              <w:rPr>
-                <w:rFonts w:ascii="Calibri" w:hAnsi="Calibri"/>
-                <w:i/>
-                <w:color w:val="BBBBBB"/>
-                <w:sz w:val="19"/>
-              </w:rPr>
-              <w:t>e.g., Zhang San</w:t>
-            </w:r>
-          </w:p>
-        </w:tc>
-        <w:tc>
-          <w:tcPr>
-            <w:tcW w:type="dxa" w:w="2266"/>
-            <w:tcBorders>
-              <w:top w:val="nil"/>
-              <w:left w:val="nil"/>
-              <w:bottom w:val="nil"/>
-              <w:right w:val="nil"/>
-              <w:insideH w:val="nil"/>
-              <w:insideV w:val="nil"/>
-            </w:tcBorders>
-          </w:tcPr>
-          <w:p>
-            <w:pPr>
-              <w:spacing w:before="60" w:after="60"/>
-            </w:pPr>
-            <w:r>
-              <w:rPr>
-                <w:rFonts w:ascii="Calibri" w:hAnsi="Calibri"/>
-                <w:b/>
-                <w:color w:val="2C5282"/>
-                <w:sz w:val="20"/>
-              </w:rPr>
-              <w:t>Email Address</w:t>
-            </w:r>
-          </w:p>
-        </w:tc>
-        <w:tc>
-          <w:tcPr>
-            <w:tcW w:type="dxa" w:w="2266"/>
-            <w:tcBorders>
-              <w:top w:val="nil"/>
-              <w:left w:val="nil"/>
-              <w:right w:val="nil"/>
-              <w:bottom w:val="single" w:sz="6" w:space="0" w:color="2C5282"/>
-            </w:tcBorders>
-          </w:tcPr>
-          <w:p>
-            <w:pPr>
-              <w:spacing w:before="60" w:after="60"/>
-            </w:pPr>
-            <w:r>
-              <w:rPr>
-                <w:rFonts w:ascii="Calibri" w:hAnsi="Calibri"/>
-                <w:i/>
-                <w:color w:val="BBBBBB"/>
-                <w:sz w:val="19"/>
-              </w:rPr>
-              <w:t>e.g., zhangsan@university.edu.cn</w:t>
-            </w:r>
-          </w:p>
-        </w:tc>
-      </w:tr>
-    </w:tbl>
-    <w:p>
-      <w:pPr>
-        <w:spacing w:before="0" w:after="0"/>
-        <w:spacing w:before="60" w:after="0"/>
-      </w:pPr>
-    </w:p>
-    <w:tbl>
-      <w:tblPr>
-        <w:tblStyle w:val="TableGrid"/>
-        <w:tblW w:type="auto" w:w="0"/>
-        <w:tblLook w:firstColumn="1" w:firstRow="1" w:lastColumn="0" w:lastRow="0" w:noHBand="0" w:noVBand="1" w:val="04A0"/>
-      </w:tblPr>
-      <w:tblGrid>
-        <w:gridCol w:w="2154"/>
-        <w:gridCol w:w="3288"/>
-        <w:gridCol w:w="2154"/>
-        <w:gridCol w:w="3288"/>
-      </w:tblGrid>
-      <w:tr>
-        <w:tc>
-          <w:tcPr>
-            <w:tcW w:type="dxa" w:w="2266"/>
-            <w:tcBorders>
-              <w:top w:val="nil"/>
-              <w:left w:val="nil"/>
-              <w:bottom w:val="nil"/>
-              <w:right w:val="nil"/>
-              <w:insideH w:val="nil"/>
-              <w:insideV w:val="nil"/>
-            </w:tcBorders>
-          </w:tcPr>
-          <w:p>
-            <w:pPr>
-              <w:spacing w:before="60" w:after="60"/>
-            </w:pPr>
-            <w:r>
-              <w:rPr>
-                <w:rFonts w:ascii="Calibri" w:hAnsi="Calibri"/>
-                <w:b/>
-                <w:color w:val="2C5282"/>
-                <w:sz w:val="20"/>
-              </w:rPr>
-              <w:t>Institution / Company</w:t>
-            </w:r>
-          </w:p>
-        </w:tc>
-        <w:tc>
-          <w:tcPr>
-            <w:tcW w:type="dxa" w:w="2266"/>
-            <w:tcBorders>
-              <w:top w:val="nil"/>
-              <w:left w:val="nil"/>
-              <w:right w:val="nil"/>
-              <w:bottom w:val="single" w:sz="6" w:space="0" w:color="2C5282"/>
-            </w:tcBorders>
-          </w:tcPr>
-          <w:p>
-            <w:pPr>
-              <w:spacing w:before="60" w:after="60"/>
-            </w:pPr>
-            <w:r>
-              <w:rPr>
-                <w:rFonts w:ascii="Calibri" w:hAnsi="Calibri"/>
-                <w:i/>
-                <w:color w:val="BBBBBB"/>
-                <w:sz w:val="19"/>
-              </w:rPr>
-              <w:t>e.g., Jilin University</w:t>
-            </w:r>
-          </w:p>
-        </w:tc>
-        <w:tc>
-          <w:tcPr>
-            <w:tcW w:type="dxa" w:w="2266"/>
-            <w:tcBorders>
-              <w:top w:val="nil"/>
-              <w:left w:val="nil"/>
-              <w:bottom w:val="nil"/>
-              <w:right w:val="nil"/>
-              <w:insideH w:val="nil"/>
-              <w:insideV w:val="nil"/>
-            </w:tcBorders>
-          </w:tcPr>
-          <w:p>
-            <w:pPr>
-              <w:spacing w:before="60" w:after="60"/>
-            </w:pPr>
-            <w:r>
-              <w:rPr>
-                <w:rFonts w:ascii="Calibri" w:hAnsi="Calibri"/>
-                <w:b/>
-                <w:color w:val="2C5282"/>
-                <w:sz w:val="20"/>
-              </w:rPr>
-              <w:t>Department / Team</w:t>
-            </w:r>
-          </w:p>
-        </w:tc>
-        <w:tc>
-          <w:tcPr>
-            <w:tcW w:type="dxa" w:w="2266"/>
-            <w:tcBorders>
-              <w:top w:val="nil"/>
-              <w:left w:val="nil"/>
-              <w:right w:val="nil"/>
-              <w:bottom w:val="single" w:sz="6" w:space="0" w:color="2C5282"/>
-            </w:tcBorders>
-          </w:tcPr>
-          <w:p>
-            <w:pPr>
-              <w:spacing w:before="60" w:after="60"/>
-            </w:pPr>
-            <w:r>
-              <w:rPr>
-                <w:rFonts w:ascii="Calibri" w:hAnsi="Calibri"/>
-                <w:i/>
-                <w:color w:val="BBBBBB"/>
-                <w:sz w:val="19"/>
-              </w:rPr>
-              <w:t>(optional)</w:t>
-            </w:r>
-          </w:p>
-        </w:tc>
-      </w:tr>
-    </w:tbl>
-    <w:p>
-      <w:pPr>
-        <w:spacing w:before="0" w:after="0"/>
-        <w:spacing w:before="60" w:after="0"/>
-      </w:pPr>
-    </w:p>
-    <w:tbl>
-      <w:tblPr>
-        <w:tblStyle w:val="TableGrid"/>
-        <w:tblW w:type="auto" w:w="0"/>
-        <w:tblLook w:firstColumn="1" w:firstRow="1" w:lastColumn="0" w:lastRow="0" w:noHBand="0" w:noVBand="1" w:val="04A0"/>
-      </w:tblPr>
-      <w:tblGrid>
-        <w:gridCol w:w="2268"/>
-        <w:gridCol w:w="8617"/>
-      </w:tblGrid>
-      <w:tr>
-        <w:tc>
-          <w:tcPr>
-            <w:tcW w:type="dxa" w:w="4533"/>
-            <w:tcBorders>
-              <w:top w:val="nil"/>
-              <w:left w:val="nil"/>
-              <w:bottom w:val="nil"/>
-              <w:right w:val="nil"/>
-              <w:insideH w:val="nil"/>
-              <w:insideV w:val="nil"/>
-            </w:tcBorders>
-          </w:tcPr>
-          <w:p>
-            <w:pPr>
-              <w:spacing w:before="60" w:after="60"/>
-            </w:pPr>
-            <w:r>
-              <w:rPr>
-                <w:rFonts w:ascii="Calibri" w:hAnsi="Calibri"/>
-                <w:b/>
-                <w:color w:val="2C5282"/>
-                <w:sz w:val="20"/>
-              </w:rPr>
-              <w:t>Country / Region</w:t>
-            </w:r>
-          </w:p>
-        </w:tc>
-        <w:tc>
-          <w:tcPr>
-            <w:tcW w:type="dxa" w:w="4533"/>
-            <w:tcBorders>
-              <w:top w:val="nil"/>
-              <w:left w:val="nil"/>
-              <w:right w:val="nil"/>
-              <w:bottom w:val="single" w:sz="6" w:space="0" w:color="2C5282"/>
-            </w:tcBorders>
-          </w:tcPr>
-          <w:p>
-            <w:pPr>
-              <w:spacing w:before="60" w:after="60"/>
-            </w:pPr>
-            <w:r>
-              <w:rPr>
-                <w:rFonts w:ascii="Calibri" w:hAnsi="Calibri"/>
-                <w:i/>
-                <w:color w:val="BBBBBB"/>
-                <w:sz w:val="19"/>
-              </w:rPr>
-              <w:t>e.g., China</w:t>
-            </w:r>
-          </w:p>
-        </w:tc>
-      </w:tr>
-    </w:tbl>
-    <w:p>
-      <w:pPr>
-        <w:spacing w:before="0" w:after="0"/>
-        <w:spacing w:before="60" w:after="0"/>
-      </w:pPr>
-    </w:p>
-    <w:p>
-      <w:pPr>
-        <w:spacing w:before="0" w:after="0"/>
-        <w:spacing w:before="260" w:after="0"/>
-      </w:pPr>
-    </w:p>
-    <w:tbl>
-      <w:tblPr>
-        <w:tblStyle w:val="TableGrid"/>
-        <w:tblW w:type="auto" w:w="0"/>
-        <w:tblLook w:firstColumn="1" w:firstRow="1" w:lastColumn="0" w:lastRow="0" w:noHBand="0" w:noVBand="1" w:val="04A0"/>
-      </w:tblPr>
-      <w:tblGrid>
-        <w:gridCol w:w="9066"/>
-      </w:tblGrid>
-      <w:tr>
-        <w:trPr>
-          <w:trHeight w:val="420"/>
-        </w:trPr>
-        <w:tc>
-          <w:tcPr>
-            <w:tcW w:type="dxa" w:w="9066"/>
-            <w:shd w:val="clear" w:color="auto" w:fill="2C5282"/>
-            <w:tcBorders>
-              <w:top w:val="nil"/>
-              <w:left w:val="nil"/>
-              <w:bottom w:val="nil"/>
-              <w:right w:val="nil"/>
-              <w:insideH w:val="nil"/>
-              <w:insideV w:val="nil"/>
-            </w:tcBorders>
-          </w:tcPr>
-          <w:p>
-            <w:pPr>
-              <w:jc w:val="left"/>
-              <w:spacing w:before="60" w:after="60"/>
-            </w:pPr>
-            <w:r>
-              <w:rPr>
-                <w:rFonts w:ascii="Calibri" w:hAnsi="Calibri"/>
-                <w:b/>
-                <w:color w:val="B0C8E8"/>
-                <w:sz w:val="20"/>
-              </w:rPr>
-              <w:t xml:space="preserve">  02  </w:t>
-            </w:r>
-            <w:r>
-              <w:rPr>
-                <w:rFonts w:ascii="Calibri" w:hAnsi="Calibri"/>
-                <w:b/>
-                <w:color w:val="FFFFFF"/>
-                <w:sz w:val="22"/>
-              </w:rPr>
-              <w:t>Intended Use</w:t>
-            </w:r>
-          </w:p>
-        </w:tc>
-      </w:tr>
-    </w:tbl>
-    <w:p>
-      <w:pPr>
-        <w:spacing w:before="0" w:after="0"/>
-      </w:pPr>
-    </w:p>
-    <w:p>
-      <w:pPr>
-        <w:spacing w:before="80" w:after="30"/>
+        <w:spacing w:before="220" w:after="30"/>
       </w:pPr>
       <w:r>
         <w:rPr>
@@ -585,217 +134,7 @@
           <w:color w:val="2C5282"/>
           <w:sz w:val="20"/>
         </w:rPr>
-        <w:t>Primary Purpose</w:t>
-      </w:r>
-    </w:p>
-    <w:tbl>
-      <w:tblPr>
-        <w:tblStyle w:val="TableGrid"/>
-        <w:tblW w:type="auto" w:w="0"/>
-        <w:tblLook w:firstColumn="1" w:firstRow="1" w:lastColumn="0" w:lastRow="0" w:noHBand="0" w:noVBand="1" w:val="04A0"/>
-      </w:tblPr>
-      <w:tblGrid>
-        <w:gridCol w:w="4533"/>
-        <w:gridCol w:w="4533"/>
-      </w:tblGrid>
-      <w:tr>
-        <w:tc>
-          <w:tcPr>
-            <w:tcW w:type="dxa" w:w="4533"/>
-            <w:tcBorders>
-              <w:top w:val="nil"/>
-              <w:left w:val="nil"/>
-              <w:bottom w:val="nil"/>
-              <w:right w:val="nil"/>
-              <w:insideH w:val="nil"/>
-              <w:insideV w:val="nil"/>
-            </w:tcBorders>
-          </w:tcPr>
-          <w:p>
-            <w:pPr>
-              <w:spacing w:before="50" w:after="50"/>
-            </w:pPr>
-            <w:r>
-              <w:rPr>
-                <w:rFonts w:ascii="Calibri" w:hAnsi="Calibri"/>
-                <w:color w:val="222222"/>
-                <w:sz w:val="20"/>
-              </w:rPr>
-              <w:t>☐   Academic Research</w:t>
-            </w:r>
-          </w:p>
-        </w:tc>
-        <w:tc>
-          <w:tcPr>
-            <w:tcW w:type="dxa" w:w="4533"/>
-            <w:tcBorders>
-              <w:top w:val="nil"/>
-              <w:left w:val="nil"/>
-              <w:bottom w:val="nil"/>
-              <w:right w:val="nil"/>
-              <w:insideH w:val="nil"/>
-              <w:insideV w:val="nil"/>
-            </w:tcBorders>
-          </w:tcPr>
-          <w:p>
-            <w:pPr>
-              <w:spacing w:before="50" w:after="50"/>
-            </w:pPr>
-            <w:r>
-              <w:rPr>
-                <w:rFonts w:ascii="Calibri" w:hAnsi="Calibri"/>
-                <w:color w:val="222222"/>
-                <w:sz w:val="20"/>
-              </w:rPr>
-              <w:t>☐   Industrial / Commercial Application</w:t>
-            </w:r>
-          </w:p>
-        </w:tc>
-      </w:tr>
-      <w:tr>
-        <w:tc>
-          <w:tcPr>
-            <w:tcW w:type="dxa" w:w="4533"/>
-            <w:tcBorders>
-              <w:top w:val="nil"/>
-              <w:left w:val="nil"/>
-              <w:bottom w:val="nil"/>
-              <w:right w:val="nil"/>
-              <w:insideH w:val="nil"/>
-              <w:insideV w:val="nil"/>
-            </w:tcBorders>
-          </w:tcPr>
-          <w:p>
-            <w:pPr>
-              <w:spacing w:before="50" w:after="50"/>
-            </w:pPr>
-            <w:r>
-              <w:rPr>
-                <w:rFonts w:ascii="Calibri" w:hAnsi="Calibri"/>
-                <w:color w:val="222222"/>
-                <w:sz w:val="20"/>
-              </w:rPr>
-              <w:t>☐   Teaching / Course Material</w:t>
-            </w:r>
-          </w:p>
-        </w:tc>
-        <w:tc>
-          <w:tcPr>
-            <w:tcW w:type="dxa" w:w="4533"/>
-            <w:tcBorders>
-              <w:top w:val="nil"/>
-              <w:left w:val="nil"/>
-              <w:bottom w:val="nil"/>
-              <w:right w:val="nil"/>
-              <w:insideH w:val="nil"/>
-              <w:insideV w:val="nil"/>
-            </w:tcBorders>
-          </w:tcPr>
-          <w:p>
-            <w:pPr>
-              <w:spacing w:before="50" w:after="50"/>
-            </w:pPr>
-            <w:r>
-              <w:rPr>
-                <w:rFonts w:ascii="Calibri" w:hAnsi="Calibri"/>
-                <w:color w:val="222222"/>
-                <w:sz w:val="20"/>
-              </w:rPr>
-              <w:t>☐   Other: ________________________________</w:t>
-            </w:r>
-          </w:p>
-        </w:tc>
-      </w:tr>
-    </w:tbl>
-    <w:p>
-      <w:pPr>
-        <w:spacing w:before="0" w:after="0"/>
-        <w:spacing w:before="60" w:after="0"/>
-      </w:pPr>
-    </w:p>
-    <w:tbl>
-      <w:tblPr>
-        <w:tblStyle w:val="TableGrid"/>
-        <w:tblW w:type="auto" w:w="0"/>
-        <w:tblLook w:firstColumn="1" w:firstRow="1" w:lastColumn="0" w:lastRow="0" w:noHBand="0" w:noVBand="1" w:val="04A0"/>
-      </w:tblPr>
-      <w:tblGrid>
-        <w:gridCol w:w="2721"/>
-        <w:gridCol w:w="8164"/>
-      </w:tblGrid>
-      <w:tr>
-        <w:tc>
-          <w:tcPr>
-            <w:tcW w:type="dxa" w:w="4533"/>
-            <w:tcBorders>
-              <w:top w:val="nil"/>
-              <w:left w:val="nil"/>
-              <w:bottom w:val="nil"/>
-              <w:right w:val="nil"/>
-              <w:insideH w:val="nil"/>
-              <w:insideV w:val="nil"/>
-            </w:tcBorders>
-          </w:tcPr>
-          <w:p>
-            <w:pPr>
-              <w:spacing w:before="60" w:after="60"/>
-            </w:pPr>
-            <w:r>
-              <w:rPr>
-                <w:rFonts w:ascii="Calibri" w:hAnsi="Calibri"/>
-                <w:b/>
-                <w:color w:val="2C5282"/>
-                <w:sz w:val="20"/>
-              </w:rPr>
-              <w:t>Project / Paper Title</w:t>
-            </w:r>
-          </w:p>
-        </w:tc>
-        <w:tc>
-          <w:tcPr>
-            <w:tcW w:type="dxa" w:w="4533"/>
-            <w:tcBorders>
-              <w:top w:val="nil"/>
-              <w:left w:val="nil"/>
-              <w:right w:val="nil"/>
-              <w:bottom w:val="single" w:sz="6" w:space="0" w:color="2C5282"/>
-            </w:tcBorders>
-          </w:tcPr>
-          <w:p>
-            <w:pPr>
-              <w:spacing w:before="60" w:after="60"/>
-            </w:pPr>
-            <w:r>
-              <w:rPr>
-                <w:rFonts w:ascii="Calibri" w:hAnsi="Calibri"/>
-                <w:i/>
-                <w:color w:val="BBBBBB"/>
-                <w:sz w:val="19"/>
-              </w:rPr>
-              <w:t>(if applicable)</w:t>
-            </w:r>
-          </w:p>
-        </w:tc>
-      </w:tr>
-    </w:tbl>
-    <w:p>
-      <w:pPr>
-        <w:spacing w:before="0" w:after="0"/>
-        <w:spacing w:before="60" w:after="0"/>
-      </w:pPr>
-    </w:p>
-    <w:p>
-      <w:pPr>
-        <w:spacing w:before="80" w:after="30"/>
-      </w:pPr>
-      <w:r>
-        <w:rPr>
-          <w:rFonts w:ascii="Calibri" w:hAnsi="Calibri"/>
-          <w:b/>
-          <w:color w:val="2C5282"/>
-          <w:sz w:val="20"/>
-        </w:rPr>
-        <w:t>Detailed Description of Intended Use</w:t>
+        <w:t>Full Name  *</w:t>
       </w:r>
     </w:p>
     <w:tbl>
@@ -815,11 +154,115 @@
               <w:top w:val="nil"/>
               <w:left w:val="nil"/>
               <w:right w:val="nil"/>
+              <w:bottom w:val="single" w:sz="6" w:space="0" w:color="2C5282"/>
+            </w:tcBorders>
+            <w:shd w:val="clear" w:color="auto" w:fill="F7FAFD"/>
+          </w:tcPr>
+          <w:p>
+            <w:pPr>
+              <w:spacing w:before="60" w:after="60"/>
+            </w:pPr>
+            <w:r>
+              <w:rPr>
+                <w:rFonts w:ascii="Calibri" w:hAnsi="Calibri"/>
+                <w:i/>
+                <w:color w:val="BBBBBB"/>
+                <w:sz w:val="19"/>
+              </w:rPr>
+              <w:t>e.g., Zhang San</w:t>
+            </w:r>
+          </w:p>
+        </w:tc>
+      </w:tr>
+    </w:tbl>
+    <w:p>
+      <w:pPr>
+        <w:spacing w:before="220" w:after="30"/>
+      </w:pPr>
+      <w:r>
+        <w:rPr>
+          <w:rFonts w:ascii="Calibri" w:hAnsi="Calibri"/>
+          <w:b/>
+          <w:color w:val="2C5282"/>
+          <w:sz w:val="20"/>
+        </w:rPr>
+        <w:t>Institution / Company  *</w:t>
+      </w:r>
+    </w:p>
+    <w:tbl>
+      <w:tblPr>
+        <w:tblStyle w:val="TableGrid"/>
+        <w:tblW w:type="auto" w:w="0"/>
+        <w:tblLook w:firstColumn="1" w:firstRow="1" w:lastColumn="0" w:lastRow="0" w:noHBand="0" w:noVBand="1" w:val="04A0"/>
+      </w:tblPr>
+      <w:tblGrid>
+        <w:gridCol w:w="9066"/>
+      </w:tblGrid>
+      <w:tr>
+        <w:tc>
+          <w:tcPr>
+            <w:tcW w:type="dxa" w:w="9066"/>
+            <w:tcBorders>
+              <w:top w:val="nil"/>
+              <w:left w:val="nil"/>
+              <w:right w:val="nil"/>
+              <w:bottom w:val="single" w:sz="6" w:space="0" w:color="2C5282"/>
+            </w:tcBorders>
+            <w:shd w:val="clear" w:color="auto" w:fill="F7FAFD"/>
+          </w:tcPr>
+          <w:p>
+            <w:pPr>
+              <w:spacing w:before="60" w:after="60"/>
+            </w:pPr>
+            <w:r>
+              <w:rPr>
+                <w:rFonts w:ascii="Calibri" w:hAnsi="Calibri"/>
+                <w:i/>
+                <w:color w:val="BBBBBB"/>
+                <w:sz w:val="19"/>
+              </w:rPr>
+              <w:t>e.g., Jilin University / Company Name</w:t>
+            </w:r>
+          </w:p>
+        </w:tc>
+      </w:tr>
+    </w:tbl>
+    <w:p>
+      <w:pPr>
+        <w:spacing w:before="220" w:after="30"/>
+      </w:pPr>
+      <w:r>
+        <w:rPr>
+          <w:rFonts w:ascii="Calibri" w:hAnsi="Calibri"/>
+          <w:b/>
+          <w:color w:val="2C5282"/>
+          <w:sz w:val="20"/>
+        </w:rPr>
+        <w:t>Detailed Description of Intended Use  *</w:t>
+      </w:r>
+    </w:p>
+    <w:tbl>
+      <w:tblPr>
+        <w:tblStyle w:val="TableGrid"/>
+        <w:tblW w:type="auto" w:w="0"/>
+        <w:tblLook w:firstColumn="1" w:firstRow="1" w:lastColumn="0" w:lastRow="0" w:noHBand="0" w:noVBand="1" w:val="04A0"/>
+      </w:tblPr>
+      <w:tblGrid>
+        <w:gridCol w:w="9066"/>
+      </w:tblGrid>
+      <w:tr>
+        <w:tc>
+          <w:tcPr>
+            <w:tcW w:type="dxa" w:w="9066"/>
+            <w:shd w:val="clear" w:color="auto" w:fill="F7FAFD"/>
+            <w:tcBorders>
+              <w:top w:val="nil"/>
+              <w:left w:val="nil"/>
+              <w:right w:val="nil"/>
               <w:insideH w:val="nil"/>
               <w:insideV w:val="nil"/>
               <w:bottom w:val="nil"/>
             </w:tcBorders>
-            <w:shd w:val="clear" w:color="auto" w:fill="F7FAFD"/>
           </w:tcPr>
           <w:p>
             <w:pPr>
@@ -832,7 +275,7 @@
                 <w:color w:val="BBBBBB"/>
                 <w:sz w:val="19"/>
               </w:rPr>
-              <w:t>Please describe your research questions, application scenario, or expected outputs...</w:t>
+              <w:t>Please describe your research questions, application scenario, or project goals...</w:t>
             </w:r>
           </w:p>
         </w:tc>
@@ -841,6 +284,7 @@
         <w:tc>
           <w:tcPr>
             <w:tcW w:type="dxa" w:w="9066"/>
+            <w:shd w:val="clear" w:color="auto" w:fill="F7FAFD"/>
             <w:tcBorders>
               <w:top w:val="nil"/>
               <w:left w:val="nil"/>
@@ -849,7 +293,6 @@
               <w:insideV w:val="nil"/>
               <w:bottom w:val="nil"/>
             </w:tcBorders>
-            <w:shd w:val="clear" w:color="auto" w:fill="F7FAFD"/>
           </w:tcPr>
           <w:p>
             <w:pPr>
@@ -862,6 +305,7 @@
         <w:tc>
           <w:tcPr>
             <w:tcW w:type="dxa" w:w="9066"/>
+            <w:shd w:val="clear" w:color="auto" w:fill="F7FAFD"/>
             <w:tcBorders>
               <w:top w:val="nil"/>
               <w:left w:val="nil"/>
@@ -870,7 +314,6 @@
               <w:insideV w:val="nil"/>
               <w:bottom w:val="nil"/>
             </w:tcBorders>
-            <w:shd w:val="clear" w:color="auto" w:fill="F7FAFD"/>
           </w:tcPr>
           <w:p>
             <w:pPr>
@@ -883,6 +326,7 @@
         <w:tc>
           <w:tcPr>
             <w:tcW w:type="dxa" w:w="9066"/>
+            <w:shd w:val="clear" w:color="auto" w:fill="F7FAFD"/>
             <w:tcBorders>
               <w:top w:val="nil"/>
               <w:left w:val="nil"/>
@@ -891,7 +335,6 @@
               <w:insideV w:val="nil"/>
               <w:bottom w:val="nil"/>
             </w:tcBorders>
-            <w:shd w:val="clear" w:color="auto" w:fill="F7FAFD"/>
           </w:tcPr>
           <w:p>
             <w:pPr>
@@ -904,6 +347,28 @@
         <w:tc>
           <w:tcPr>
             <w:tcW w:type="dxa" w:w="9066"/>
+            <w:shd w:val="clear" w:color="auto" w:fill="F7FAFD"/>
+            <w:tcBorders>
+              <w:top w:val="nil"/>
+              <w:left w:val="nil"/>
+              <w:right w:val="nil"/>
+              <w:insideH w:val="nil"/>
+              <w:insideV w:val="nil"/>
+              <w:bottom w:val="nil"/>
+            </w:tcBorders>
+          </w:tcPr>
+          <w:p>
+            <w:pPr>
+              <w:spacing w:before="60" w:after="0"/>
+            </w:pPr>
+          </w:p>
+        </w:tc>
+      </w:tr>
+      <w:tr>
+        <w:tc>
+          <w:tcPr>
+            <w:tcW w:type="dxa" w:w="9066"/>
+            <w:shd w:val="clear" w:color="auto" w:fill="F7FAFD"/>
             <w:tcBorders>
               <w:top w:val="nil"/>
               <w:left w:val="nil"/>
@@ -912,7 +377,6 @@
               <w:insideV w:val="nil"/>
               <w:bottom w:val="single" w:sz="6" w:color="2C5282"/>
             </w:tcBorders>
-            <w:shd w:val="clear" w:color="auto" w:fill="F7FAFD"/>
           </w:tcPr>
           <w:p>
             <w:pPr>
@@ -924,13 +388,7 @@
     </w:tbl>
     <w:p>
       <w:pPr>
-        <w:spacing w:before="0" w:after="0"/>
-        <w:spacing w:before="80" w:after="0"/>
-      </w:pPr>
-    </w:p>
-    <w:p>
-      <w:pPr>
-        <w:spacing w:before="80" w:after="30"/>
+        <w:spacing w:before="260" w:after="30"/>
       </w:pPr>
       <w:r>
         <w:rPr>
@@ -939,383 +397,8 @@
           <w:color w:val="2C5282"/>
           <w:sz w:val="20"/>
         </w:rPr>
-        <w:t>Expected Usage Scale</w:t>
+        <w:t>Acknowledgement  *</w:t>
       </w:r>
-    </w:p>
-    <w:tbl>
-      <w:tblPr>
-        <w:tblStyle w:val="TableGrid"/>
-        <w:tblW w:type="auto" w:w="0"/>
-        <w:tblLook w:firstColumn="1" w:firstRow="1" w:lastColumn="0" w:lastRow="0" w:noHBand="0" w:noVBand="1" w:val="04A0"/>
-      </w:tblPr>
-      <w:tblGrid>
-        <w:gridCol w:w="4533"/>
-        <w:gridCol w:w="4533"/>
-      </w:tblGrid>
-      <w:tr>
-        <w:tc>
-          <w:tcPr>
-            <w:tcW w:type="dxa" w:w="4533"/>
-            <w:tcBorders>
-              <w:top w:val="nil"/>
-              <w:left w:val="nil"/>
-              <w:bottom w:val="nil"/>
-              <w:right w:val="nil"/>
-              <w:insideH w:val="nil"/>
-              <w:insideV w:val="nil"/>
-            </w:tcBorders>
-          </w:tcPr>
-          <w:p>
-            <w:pPr>
-              <w:spacing w:before="50" w:after="50"/>
-            </w:pPr>
-            <w:r>
-              <w:rPr>
-                <w:rFonts w:ascii="Calibri" w:hAnsi="Calibri"/>
-                <w:color w:val="222222"/>
-                <w:sz w:val="20"/>
-              </w:rPr>
-              <w:t>☐   Small-scale exploration / proof-of-concept</w:t>
-            </w:r>
-          </w:p>
-        </w:tc>
-        <w:tc>
-          <w:tcPr>
-            <w:tcW w:type="dxa" w:w="4533"/>
-            <w:tcBorders>
-              <w:top w:val="nil"/>
-              <w:left w:val="nil"/>
-              <w:bottom w:val="nil"/>
-              <w:right w:val="nil"/>
-              <w:insideH w:val="nil"/>
-              <w:insideV w:val="nil"/>
-            </w:tcBorders>
-          </w:tcPr>
-          <w:p>
-            <w:pPr>
-              <w:spacing w:before="50" w:after="50"/>
-            </w:pPr>
-            <w:r>
-              <w:rPr>
-                <w:rFonts w:ascii="Calibri" w:hAnsi="Calibri"/>
-                <w:color w:val="222222"/>
-                <w:sz w:val="20"/>
-              </w:rPr>
-              <w:t>☐   Full dataset for research publication</w:t>
-            </w:r>
-          </w:p>
-        </w:tc>
-      </w:tr>
-      <w:tr>
-        <w:tc>
-          <w:tcPr>
-            <w:tcW w:type="dxa" w:w="4533"/>
-            <w:tcBorders>
-              <w:top w:val="nil"/>
-              <w:left w:val="nil"/>
-              <w:bottom w:val="nil"/>
-              <w:right w:val="nil"/>
-              <w:insideH w:val="nil"/>
-              <w:insideV w:val="nil"/>
-            </w:tcBorders>
-          </w:tcPr>
-          <w:p>
-            <w:pPr>
-              <w:spacing w:before="50" w:after="50"/>
-            </w:pPr>
-            <w:r>
-              <w:rPr>
-                <w:rFonts w:ascii="Calibri" w:hAnsi="Calibri"/>
-                <w:color w:val="222222"/>
-                <w:sz w:val="20"/>
-              </w:rPr>
-              <w:t>☐   Large-scale commercial deployment</w:t>
-            </w:r>
-          </w:p>
-        </w:tc>
-        <w:tc>
-          <w:tcPr>
-            <w:tcW w:type="dxa" w:w="4533"/>
-            <w:tcBorders>
-              <w:top w:val="nil"/>
-              <w:left w:val="nil"/>
-              <w:bottom w:val="nil"/>
-              <w:right w:val="nil"/>
-              <w:insideH w:val="nil"/>
-              <w:insideV w:val="nil"/>
-            </w:tcBorders>
-          </w:tcPr>
-          <w:p>
-            <w:pPr>
-              <w:spacing w:before="50" w:after="50"/>
-            </w:pPr>
-            <w:r>
-              <w:rPr>
-                <w:rFonts w:ascii="Calibri" w:hAnsi="Calibri"/>
-                <w:color w:val="222222"/>
-                <w:sz w:val="20"/>
-              </w:rPr>
-              <w:t>☐   Other: ________________________________</w:t>
-            </w:r>
-          </w:p>
-        </w:tc>
-      </w:tr>
-    </w:tbl>
-    <w:p>
-      <w:pPr>
-        <w:spacing w:before="0" w:after="0"/>
-        <w:spacing w:before="60" w:after="0"/>
-      </w:pPr>
-    </w:p>
-    <w:p>
-      <w:pPr>
-        <w:spacing w:before="80" w:after="30"/>
-      </w:pPr>
-      <w:r>
-        <w:rPr>
-          <w:rFonts w:ascii="Calibri" w:hAnsi="Calibri"/>
-          <w:b/>
-          <w:color w:val="2C5282"/>
-          <w:sz w:val="20"/>
-        </w:rPr>
-        <w:t>Will results / findings be published?</w:t>
-      </w:r>
-    </w:p>
-    <w:tbl>
-      <w:tblPr>
-        <w:tblStyle w:val="TableGrid"/>
-        <w:tblW w:type="auto" w:w="0"/>
-        <w:tblLook w:firstColumn="1" w:firstRow="1" w:lastColumn="0" w:lastRow="0" w:noHBand="0" w:noVBand="1" w:val="04A0"/>
-      </w:tblPr>
-      <w:tblGrid>
-        <w:gridCol w:w="2266"/>
-        <w:gridCol w:w="2266"/>
-        <w:gridCol w:w="2266"/>
-        <w:gridCol w:w="2266"/>
-      </w:tblGrid>
-      <w:tr>
-        <w:tc>
-          <w:tcPr>
-            <w:tcW w:type="dxa" w:w="2266"/>
-            <w:tcBorders>
-              <w:top w:val="nil"/>
-              <w:left w:val="nil"/>
-              <w:bottom w:val="nil"/>
-              <w:right w:val="nil"/>
-              <w:insideH w:val="nil"/>
-              <w:insideV w:val="nil"/>
-            </w:tcBorders>
-          </w:tcPr>
-          <w:p>
-            <w:pPr>
-              <w:spacing w:before="50" w:after="50"/>
-            </w:pPr>
-            <w:r>
-              <w:rPr>
-                <w:rFonts w:ascii="Calibri" w:hAnsi="Calibri"/>
-                <w:color w:val="222222"/>
-                <w:sz w:val="20"/>
-              </w:rPr>
-              <w:t>☐   Yes</w:t>
-            </w:r>
-          </w:p>
-        </w:tc>
-        <w:tc>
-          <w:tcPr>
-            <w:tcW w:type="dxa" w:w="2266"/>
-            <w:tcBorders>
-              <w:top w:val="nil"/>
-              <w:left w:val="nil"/>
-              <w:bottom w:val="nil"/>
-              <w:right w:val="nil"/>
-              <w:insideH w:val="nil"/>
-              <w:insideV w:val="nil"/>
-            </w:tcBorders>
-          </w:tcPr>
-          <w:p>
-            <w:pPr>
-              <w:spacing w:before="50" w:after="50"/>
-            </w:pPr>
-            <w:r>
-              <w:rPr>
-                <w:rFonts w:ascii="Calibri" w:hAnsi="Calibri"/>
-                <w:color w:val="222222"/>
-                <w:sz w:val="20"/>
-              </w:rPr>
-              <w:t>☐   No</w:t>
-            </w:r>
-          </w:p>
-        </w:tc>
-        <w:tc>
-          <w:tcPr>
-            <w:tcW w:type="dxa" w:w="2266"/>
-            <w:tcBorders>
-              <w:top w:val="nil"/>
-              <w:left w:val="nil"/>
-              <w:bottom w:val="nil"/>
-              <w:right w:val="nil"/>
-              <w:insideH w:val="nil"/>
-              <w:insideV w:val="nil"/>
-            </w:tcBorders>
-          </w:tcPr>
-          <w:p/>
-        </w:tc>
-        <w:tc>
-          <w:tcPr>
-            <w:tcW w:type="dxa" w:w="2266"/>
-            <w:tcBorders>
-              <w:top w:val="nil"/>
-              <w:left w:val="nil"/>
-              <w:bottom w:val="nil"/>
-              <w:right w:val="nil"/>
-              <w:insideH w:val="nil"/>
-              <w:insideV w:val="nil"/>
-            </w:tcBorders>
-          </w:tcPr>
-          <w:p/>
-        </w:tc>
-      </w:tr>
-    </w:tbl>
-    <w:p>
-      <w:pPr>
-        <w:spacing w:before="0" w:after="0"/>
-        <w:spacing w:before="60" w:after="0"/>
-      </w:pPr>
-    </w:p>
-    <w:tbl>
-      <w:tblPr>
-        <w:tblStyle w:val="TableGrid"/>
-        <w:tblW w:type="auto" w:w="0"/>
-        <w:tblLook w:firstColumn="1" w:firstRow="1" w:lastColumn="0" w:lastRow="0" w:noHBand="0" w:noVBand="1" w:val="04A0"/>
-      </w:tblPr>
-      <w:tblGrid>
-        <w:gridCol w:w="2948"/>
-        <w:gridCol w:w="7937"/>
-      </w:tblGrid>
-      <w:tr>
-        <w:tc>
-          <w:tcPr>
-            <w:tcW w:type="dxa" w:w="4533"/>
-            <w:tcBorders>
-              <w:top w:val="nil"/>
-              <w:left w:val="nil"/>
-              <w:bottom w:val="nil"/>
-              <w:right w:val="nil"/>
-              <w:insideH w:val="nil"/>
-              <w:insideV w:val="nil"/>
-            </w:tcBorders>
-          </w:tcPr>
-          <w:p>
-            <w:pPr>
-              <w:spacing w:before="60" w:after="60"/>
-            </w:pPr>
-            <w:r>
-              <w:rPr>
-                <w:rFonts w:ascii="Calibri" w:hAnsi="Calibri"/>
-                <w:b/>
-                <w:color w:val="2C5282"/>
-                <w:sz w:val="20"/>
-              </w:rPr>
-              <w:t>Target journal / conference</w:t>
-            </w:r>
-          </w:p>
-        </w:tc>
-        <w:tc>
-          <w:tcPr>
-            <w:tcW w:type="dxa" w:w="4533"/>
-            <w:tcBorders>
-              <w:top w:val="nil"/>
-              <w:left w:val="nil"/>
-              <w:right w:val="nil"/>
-              <w:bottom w:val="single" w:sz="6" w:space="0" w:color="2C5282"/>
-            </w:tcBorders>
-          </w:tcPr>
-          <w:p>
-            <w:pPr>
-              <w:spacing w:before="60" w:after="60"/>
-            </w:pPr>
-            <w:r>
-              <w:rPr>
-                <w:rFonts w:ascii="Calibri" w:hAnsi="Calibri"/>
-                <w:i/>
-                <w:color w:val="BBBBBB"/>
-                <w:sz w:val="19"/>
-              </w:rPr>
-              <w:t>(if applicable)</w:t>
-            </w:r>
-          </w:p>
-        </w:tc>
-      </w:tr>
-    </w:tbl>
-    <w:p>
-      <w:pPr>
-        <w:spacing w:before="0" w:after="0"/>
-        <w:spacing w:before="60" w:after="0"/>
-      </w:pPr>
-    </w:p>
-    <w:p>
-      <w:pPr>
-        <w:spacing w:before="0" w:after="0"/>
-        <w:spacing w:before="260" w:after="0"/>
-      </w:pPr>
-    </w:p>
-    <w:tbl>
-      <w:tblPr>
-        <w:tblStyle w:val="TableGrid"/>
-        <w:tblW w:type="auto" w:w="0"/>
-        <w:tblLook w:firstColumn="1" w:firstRow="1" w:lastColumn="0" w:lastRow="0" w:noHBand="0" w:noVBand="1" w:val="04A0"/>
-      </w:tblPr>
-      <w:tblGrid>
-        <w:gridCol w:w="9066"/>
-      </w:tblGrid>
-      <w:tr>
-        <w:trPr>
-          <w:trHeight w:val="420"/>
-        </w:trPr>
-        <w:tc>
-          <w:tcPr>
-            <w:tcW w:type="dxa" w:w="9066"/>
-            <w:shd w:val="clear" w:color="auto" w:fill="2C5282"/>
-            <w:tcBorders>
-              <w:top w:val="nil"/>
-              <w:left w:val="nil"/>
-              <w:bottom w:val="nil"/>
-              <w:right w:val="nil"/>
-              <w:insideH w:val="nil"/>
-              <w:insideV w:val="nil"/>
-            </w:tcBorders>
-          </w:tcPr>
-          <w:p>
-            <w:pPr>
-              <w:jc w:val="left"/>
-              <w:spacing w:before="60" w:after="60"/>
-            </w:pPr>
-            <w:r>
-              <w:rPr>
-                <w:rFonts w:ascii="Calibri" w:hAnsi="Calibri"/>
-                <w:b/>
-                <w:color w:val="B0C8E8"/>
-                <w:sz w:val="20"/>
-              </w:rPr>
-              <w:t xml:space="preserve">  03  </w:t>
-            </w:r>
-            <w:r>
-              <w:rPr>
-                <w:rFonts w:ascii="Calibri" w:hAnsi="Calibri"/>
-                <w:b/>
-                <w:color w:val="FFFFFF"/>
-                <w:sz w:val="22"/>
-              </w:rPr>
-              <w:t>Acknowledgement</w:t>
-            </w:r>
-          </w:p>
-        </w:tc>
-      </w:tr>
-    </w:tbl>
-    <w:p>
-      <w:pPr>
-        <w:spacing w:before="0" w:after="0"/>
-      </w:pPr>
     </w:p>
     <w:tbl>
       <w:tblPr>
@@ -1387,7 +470,6 @@
     </w:tbl>
     <w:p>
       <w:pPr>
-        <w:spacing w:before="0" w:after="0"/>
         <w:spacing w:before="50" w:after="0"/>
       </w:pPr>
     </w:p>
@@ -1461,7 +543,6 @@
     </w:tbl>
     <w:p>
       <w:pPr>
-        <w:spacing w:before="0" w:after="0"/>
         <w:spacing w:before="50" w:after="0"/>
       </w:pPr>
     </w:p>
@@ -1535,99 +616,12 @@
     </w:tbl>
     <w:p>
       <w:pPr>
-        <w:spacing w:before="0" w:after="0"/>
         <w:spacing w:before="50" w:after="0"/>
       </w:pPr>
     </w:p>
     <w:p>
       <w:pPr>
-        <w:spacing w:before="0" w:after="0"/>
-        <w:spacing w:before="180" w:after="0"/>
-      </w:pPr>
-    </w:p>
-    <w:tbl>
-      <w:tblPr>
-        <w:tblStyle w:val="TableGrid"/>
-        <w:tblW w:type="auto" w:w="0"/>
-        <w:tblLook w:firstColumn="1" w:firstRow="1" w:lastColumn="0" w:lastRow="0" w:noHBand="0" w:noVBand="1" w:val="04A0"/>
-      </w:tblPr>
-      <w:tblGrid>
-        <w:gridCol w:w="4533"/>
-        <w:gridCol w:w="4533"/>
-      </w:tblGrid>
-      <w:tr>
-        <w:tc>
-          <w:tcPr>
-            <w:tcW w:type="dxa" w:w="4533"/>
-            <w:tcBorders>
-              <w:top w:val="nil"/>
-              <w:left w:val="nil"/>
-              <w:bottom w:val="nil"/>
-              <w:right w:val="nil"/>
-              <w:insideH w:val="nil"/>
-              <w:insideV w:val="nil"/>
-            </w:tcBorders>
-            <w:tcBorders>
-              <w:top w:val="nil"/>
-              <w:left w:val="nil"/>
-              <w:right w:val="nil"/>
-              <w:bottom w:val="single" w:sz="6" w:space="0" w:color="2C5282"/>
-            </w:tcBorders>
-          </w:tcPr>
-          <w:p>
-            <w:pPr>
-              <w:spacing w:before="60" w:after="60"/>
-            </w:pPr>
-            <w:r>
-              <w:rPr>
-                <w:rFonts w:ascii="Calibri" w:hAnsi="Calibri"/>
-                <w:b/>
-                <w:color w:val="2C5282"/>
-                <w:sz w:val="20"/>
-              </w:rPr>
-              <w:t>Signature:</w:t>
-            </w:r>
-          </w:p>
-        </w:tc>
-        <w:tc>
-          <w:tcPr>
-            <w:tcW w:type="dxa" w:w="4533"/>
-            <w:tcBorders>
-              <w:top w:val="nil"/>
-              <w:left w:val="nil"/>
-              <w:bottom w:val="nil"/>
-              <w:right w:val="nil"/>
-              <w:insideH w:val="nil"/>
-              <w:insideV w:val="nil"/>
-            </w:tcBorders>
-            <w:tcBorders>
-              <w:top w:val="nil"/>
-              <w:left w:val="nil"/>
-              <w:right w:val="nil"/>
-              <w:bottom w:val="single" w:sz="6" w:space="0" w:color="2C5282"/>
-            </w:tcBorders>
-          </w:tcPr>
-          <w:p>
-            <w:pPr>
-              <w:spacing w:before="60" w:after="60"/>
-            </w:pPr>
-            <w:r>
-              <w:rPr>
-                <w:rFonts w:ascii="Calibri" w:hAnsi="Calibri"/>
-                <w:b/>
-                <w:color w:val="2C5282"/>
-                <w:sz w:val="20"/>
-              </w:rPr>
-              <w:t>Date:</w:t>
-            </w:r>
-          </w:p>
-        </w:tc>
-      </w:tr>
-    </w:tbl>
-    <w:p>
-      <w:pPr>
-        <w:spacing w:before="0" w:after="0"/>
-        <w:spacing w:before="220" w:after="0"/>
+        <w:spacing w:before="240" w:after="0"/>
       </w:pPr>
     </w:p>
     <w:tbl>

</xml_diff>